<commit_message>
Adding the report generation logic to User class, Course class, and Report class
</commit_message>
<xml_diff>
--- a/Practice Idea - Learning Hub App.docx
+++ b/Practice Idea - Learning Hub App.docx
@@ -51,7 +51,7 @@
     <w:p>
       <w:r>
         <w:pict w14:anchorId="2E83C7F7">
-          <v:rect id="_x0000_i1043" style="width:0;height:1.5pt" o:hralign="center" o:hrstd="t" o:hr="t" fillcolor="#a0a0a0" stroked="f"/>
+          <v:rect id="_x0000_i1025" style="width:0;height:1.5pt" o:hralign="center" o:hrstd="t" o:hr="t" fillcolor="#a0a0a0" stroked="f"/>
         </w:pict>
       </w:r>
     </w:p>
@@ -379,7 +379,7 @@
     <w:p>
       <w:r>
         <w:pict w14:anchorId="109B2414">
-          <v:rect id="_x0000_i1044" style="width:0;height:1.5pt" o:hralign="center" o:hrstd="t" o:hr="t" fillcolor="#a0a0a0" stroked="f"/>
+          <v:rect id="_x0000_i1026" style="width:0;height:1.5pt" o:hralign="center" o:hrstd="t" o:hr="t" fillcolor="#a0a0a0" stroked="f"/>
         </w:pict>
       </w:r>
     </w:p>
@@ -432,7 +432,7 @@
     <w:p>
       <w:r>
         <w:pict w14:anchorId="2AC3C279">
-          <v:rect id="_x0000_i1045" style="width:0;height:1.5pt" o:hralign="center" o:hrstd="t" o:hr="t" fillcolor="#a0a0a0" stroked="f"/>
+          <v:rect id="_x0000_i1027" style="width:0;height:1.5pt" o:hralign="center" o:hrstd="t" o:hr="t" fillcolor="#a0a0a0" stroked="f"/>
         </w:pict>
       </w:r>
     </w:p>
@@ -457,6 +457,609 @@
         <w:t xml:space="preserve"> (like a Fitness Tracker or Library System) with a similar feature list, so you have multiple practice directions?</w:t>
       </w:r>
     </w:p>
+    <w:p/>
+    <w:p/>
+    <w:p>
+      <w:pPr>
+        <w:pStyle w:val="Title"/>
+        <w:pBdr>
+          <w:bottom w:val="single" w:sz="4" w:space="1" w:color="auto"/>
+        </w:pBdr>
+      </w:pPr>
+      <w:r>
+        <w:t>CoPilot Feedback 1:</w:t>
+      </w:r>
+    </w:p>
+    <w:p/>
+    <w:p>
+      <w:r>
+        <w:t xml:space="preserve">Yostina, this is looking really solid </w:t>
+      </w:r>
+      <w:r>
+        <w:rPr>
+          <w:rFonts w:ascii="Segoe UI Emoji" w:hAnsi="Segoe UI Emoji" w:cs="Segoe UI Emoji"/>
+        </w:rPr>
+        <w:t>👏</w:t>
+      </w:r>
+      <w:r>
+        <w:t xml:space="preserve"> — you’ve pulled together a full mini</w:t>
+      </w:r>
+      <w:r>
+        <w:noBreakHyphen/>
+        <w:t>framework for your Learning Hub app. Let me give you a structured review:</w:t>
+      </w:r>
+    </w:p>
+    <w:p>
+      <w:r>
+        <w:pict w14:anchorId="45EB6333">
+          <v:rect id="_x0000_i1052" style="width:0;height:1.5pt" o:hralign="center" o:hrstd="t" o:hr="t" fillcolor="#a0a0a0" stroked="f"/>
+        </w:pict>
+      </w:r>
+    </w:p>
+    <w:p>
+      <w:pPr>
+        <w:rPr>
+          <w:b/>
+          <w:bCs/>
+        </w:rPr>
+      </w:pPr>
+      <w:r>
+        <w:rPr>
+          <w:rFonts w:ascii="Segoe UI Emoji" w:hAnsi="Segoe UI Emoji" w:cs="Segoe UI Emoji"/>
+          <w:b/>
+          <w:bCs/>
+        </w:rPr>
+        <w:t>✅</w:t>
+      </w:r>
+      <w:r>
+        <w:rPr>
+          <w:b/>
+          <w:bCs/>
+        </w:rPr>
+        <w:t xml:space="preserve"> Strengths</w:t>
+      </w:r>
+    </w:p>
+    <w:p>
+      <w:pPr>
+        <w:numPr>
+          <w:ilvl w:val="0"/>
+          <w:numId w:val="2"/>
+        </w:numPr>
+      </w:pPr>
+      <w:r>
+        <w:rPr>
+          <w:b/>
+          <w:bCs/>
+        </w:rPr>
+        <w:t>User hierarchy</w:t>
+      </w:r>
+      <w:r>
+        <w:t xml:space="preserve">: You’ve got User, </w:t>
+      </w:r>
+      <w:proofErr w:type="spellStart"/>
+      <w:r>
+        <w:t>RegularUser</w:t>
+      </w:r>
+      <w:proofErr w:type="spellEnd"/>
+      <w:r>
+        <w:t xml:space="preserve">, </w:t>
+      </w:r>
+      <w:proofErr w:type="spellStart"/>
+      <w:r>
+        <w:t>GuestUser</w:t>
+      </w:r>
+      <w:proofErr w:type="spellEnd"/>
+      <w:r>
+        <w:t xml:space="preserve">, and </w:t>
+      </w:r>
+      <w:proofErr w:type="spellStart"/>
+      <w:r>
+        <w:t>AdminUser</w:t>
+      </w:r>
+      <w:proofErr w:type="spellEnd"/>
+      <w:r>
+        <w:t xml:space="preserve"> clearly separated, with login/logout logic in the right places.</w:t>
+      </w:r>
+    </w:p>
+    <w:p>
+      <w:pPr>
+        <w:numPr>
+          <w:ilvl w:val="0"/>
+          <w:numId w:val="2"/>
+        </w:numPr>
+      </w:pPr>
+      <w:r>
+        <w:rPr>
+          <w:b/>
+          <w:bCs/>
+        </w:rPr>
+        <w:t>Course tracking</w:t>
+      </w:r>
+      <w:r>
+        <w:t>: Using a Map&lt;</w:t>
+      </w:r>
+      <w:proofErr w:type="spellStart"/>
+      <w:r>
+        <w:t>String,bool</w:t>
+      </w:r>
+      <w:proofErr w:type="spellEnd"/>
+      <w:r>
+        <w:t>&gt; for lessons is perfect — it makes progress calculation straightforward.</w:t>
+      </w:r>
+    </w:p>
+    <w:p>
+      <w:pPr>
+        <w:numPr>
+          <w:ilvl w:val="0"/>
+          <w:numId w:val="2"/>
+        </w:numPr>
+      </w:pPr>
+      <w:r>
+        <w:rPr>
+          <w:b/>
+          <w:bCs/>
+        </w:rPr>
+        <w:lastRenderedPageBreak/>
+        <w:t>Report class</w:t>
+      </w:r>
+      <w:r>
+        <w:t>: Clean separation of responsibility. User generates the report, Report handles the printing.</w:t>
+      </w:r>
+    </w:p>
+    <w:p>
+      <w:pPr>
+        <w:numPr>
+          <w:ilvl w:val="0"/>
+          <w:numId w:val="2"/>
+        </w:numPr>
+      </w:pPr>
+      <w:r>
+        <w:rPr>
+          <w:b/>
+          <w:bCs/>
+        </w:rPr>
+        <w:t>Progress calculation</w:t>
+      </w:r>
+      <w:r>
+        <w:t xml:space="preserve">: Your </w:t>
+      </w:r>
+      <w:proofErr w:type="spellStart"/>
+      <w:r>
+        <w:t>compPercent</w:t>
+      </w:r>
+      <w:proofErr w:type="spellEnd"/>
+      <w:r>
+        <w:t xml:space="preserve">() and </w:t>
+      </w:r>
+      <w:proofErr w:type="spellStart"/>
+      <w:r>
+        <w:t>milStoneNotify</w:t>
+      </w:r>
+      <w:proofErr w:type="spellEnd"/>
+      <w:r>
+        <w:t>() methods are well</w:t>
+      </w:r>
+      <w:r>
+        <w:noBreakHyphen/>
+        <w:t>structured and tie directly to lesson completion.</w:t>
+      </w:r>
+    </w:p>
+    <w:p>
+      <w:r>
+        <w:pict w14:anchorId="72497D02">
+          <v:rect id="_x0000_i1053" style="width:0;height:1.5pt" o:hralign="center" o:hrstd="t" o:hr="t" fillcolor="#a0a0a0" stroked="f"/>
+        </w:pict>
+      </w:r>
+    </w:p>
+    <w:p>
+      <w:pPr>
+        <w:rPr>
+          <w:b/>
+          <w:bCs/>
+        </w:rPr>
+      </w:pPr>
+      <w:r>
+        <w:rPr>
+          <w:rFonts w:ascii="Segoe UI Emoji" w:hAnsi="Segoe UI Emoji" w:cs="Segoe UI Emoji"/>
+          <w:b/>
+          <w:bCs/>
+        </w:rPr>
+        <w:t>⚠️</w:t>
+      </w:r>
+      <w:r>
+        <w:rPr>
+          <w:b/>
+          <w:bCs/>
+        </w:rPr>
+        <w:t xml:space="preserve"> Areas to refine</w:t>
+      </w:r>
+    </w:p>
+    <w:p>
+      <w:pPr>
+        <w:numPr>
+          <w:ilvl w:val="0"/>
+          <w:numId w:val="3"/>
+        </w:numPr>
+      </w:pPr>
+      <w:r>
+        <w:rPr>
+          <w:b/>
+          <w:bCs/>
+        </w:rPr>
+        <w:t>Lesson completion tracking</w:t>
+      </w:r>
+    </w:p>
+    <w:p>
+      <w:pPr>
+        <w:numPr>
+          <w:ilvl w:val="1"/>
+          <w:numId w:val="3"/>
+        </w:numPr>
+      </w:pPr>
+      <w:r>
+        <w:t xml:space="preserve">Right now you increment </w:t>
+      </w:r>
+      <w:proofErr w:type="spellStart"/>
+      <w:r>
+        <w:t>finCourseLessons</w:t>
+      </w:r>
+      <w:proofErr w:type="spellEnd"/>
+      <w:r>
+        <w:t xml:space="preserve"> manually in </w:t>
+      </w:r>
+      <w:proofErr w:type="spellStart"/>
+      <w:r>
+        <w:t>studyLesson</w:t>
+      </w:r>
+      <w:proofErr w:type="spellEnd"/>
+      <w:r>
+        <w:t>. That risks double</w:t>
+      </w:r>
+      <w:r>
+        <w:noBreakHyphen/>
+        <w:t>counting if the same lesson is studied twice.</w:t>
+      </w:r>
+    </w:p>
+    <w:p>
+      <w:pPr>
+        <w:numPr>
+          <w:ilvl w:val="1"/>
+          <w:numId w:val="3"/>
+        </w:numPr>
+      </w:pPr>
+      <w:r>
+        <w:t>Better: update the lessons map (lessons[</w:t>
+      </w:r>
+      <w:proofErr w:type="spellStart"/>
+      <w:r>
+        <w:t>lesson.key</w:t>
+      </w:r>
+      <w:proofErr w:type="spellEnd"/>
+      <w:r>
+        <w:t xml:space="preserve">] = true) and compute </w:t>
+      </w:r>
+      <w:proofErr w:type="spellStart"/>
+      <w:r>
+        <w:t>finCourseLessons</w:t>
+      </w:r>
+      <w:proofErr w:type="spellEnd"/>
+      <w:r>
+        <w:t xml:space="preserve"> dynamically from the map instead of storing it separately.</w:t>
+      </w:r>
+    </w:p>
+    <w:p>
+      <w:pPr>
+        <w:numPr>
+          <w:ilvl w:val="0"/>
+          <w:numId w:val="3"/>
+        </w:numPr>
+      </w:pPr>
+      <w:r>
+        <w:rPr>
+          <w:b/>
+          <w:bCs/>
+        </w:rPr>
+        <w:t>Login/logout duplication</w:t>
+      </w:r>
+    </w:p>
+    <w:p>
+      <w:pPr>
+        <w:numPr>
+          <w:ilvl w:val="1"/>
+          <w:numId w:val="3"/>
+        </w:numPr>
+      </w:pPr>
+      <w:r>
+        <w:t xml:space="preserve">Both </w:t>
+      </w:r>
+      <w:proofErr w:type="spellStart"/>
+      <w:r>
+        <w:t>RegularUser</w:t>
+      </w:r>
+      <w:proofErr w:type="spellEnd"/>
+      <w:r>
+        <w:t xml:space="preserve"> and </w:t>
+      </w:r>
+      <w:proofErr w:type="spellStart"/>
+      <w:r>
+        <w:t>AdminUser</w:t>
+      </w:r>
+      <w:proofErr w:type="spellEnd"/>
+      <w:r>
+        <w:t xml:space="preserve"> have identical login/logout methods.</w:t>
+      </w:r>
+    </w:p>
+    <w:p>
+      <w:pPr>
+        <w:numPr>
+          <w:ilvl w:val="1"/>
+          <w:numId w:val="3"/>
+        </w:numPr>
+      </w:pPr>
+      <w:r>
+        <w:t xml:space="preserve">This is a perfect case for a </w:t>
+      </w:r>
+      <w:proofErr w:type="spellStart"/>
+      <w:r>
+        <w:rPr>
+          <w:b/>
+          <w:bCs/>
+        </w:rPr>
+        <w:t>mixin</w:t>
+      </w:r>
+      <w:proofErr w:type="spellEnd"/>
+      <w:r>
+        <w:t xml:space="preserve"> — you can re</w:t>
+      </w:r>
+      <w:r>
+        <w:noBreakHyphen/>
+        <w:t xml:space="preserve">enable your </w:t>
+      </w:r>
+      <w:proofErr w:type="spellStart"/>
+      <w:r>
+        <w:t>LogInLogOut</w:t>
+      </w:r>
+      <w:proofErr w:type="spellEnd"/>
+      <w:r>
+        <w:t xml:space="preserve"> </w:t>
+      </w:r>
+      <w:proofErr w:type="spellStart"/>
+      <w:r>
+        <w:t>mixin</w:t>
+      </w:r>
+      <w:proofErr w:type="spellEnd"/>
+      <w:r>
+        <w:t xml:space="preserve"> and let both classes reuse it, instead of duplicating code.</w:t>
+      </w:r>
+    </w:p>
+    <w:p>
+      <w:pPr>
+        <w:numPr>
+          <w:ilvl w:val="0"/>
+          <w:numId w:val="3"/>
+        </w:numPr>
+      </w:pPr>
+      <w:r>
+        <w:rPr>
+          <w:b/>
+          <w:bCs/>
+        </w:rPr>
+        <w:t>Milestone notifications</w:t>
+      </w:r>
+    </w:p>
+    <w:p>
+      <w:pPr>
+        <w:numPr>
+          <w:ilvl w:val="1"/>
+          <w:numId w:val="3"/>
+        </w:numPr>
+      </w:pPr>
+      <w:r>
+        <w:t>Right now you check for exact percentages (25, 50, 75, 100). But floating</w:t>
+      </w:r>
+      <w:r>
+        <w:noBreakHyphen/>
+        <w:t>point math can be imprecise.</w:t>
+      </w:r>
+    </w:p>
+    <w:p>
+      <w:pPr>
+        <w:numPr>
+          <w:ilvl w:val="1"/>
+          <w:numId w:val="3"/>
+        </w:numPr>
+      </w:pPr>
+      <w:r>
+        <w:t>Safer: check with ranges (e.g., progress &gt;= 75 &amp;&amp; progress &lt; 100) so you don’t miss milestones due to rounding.</w:t>
+      </w:r>
+    </w:p>
+    <w:p>
+      <w:pPr>
+        <w:numPr>
+          <w:ilvl w:val="0"/>
+          <w:numId w:val="3"/>
+        </w:numPr>
+      </w:pPr>
+      <w:r>
+        <w:rPr>
+          <w:b/>
+          <w:bCs/>
+        </w:rPr>
+        <w:t>Return types</w:t>
+      </w:r>
+    </w:p>
+    <w:p>
+      <w:pPr>
+        <w:numPr>
+          <w:ilvl w:val="1"/>
+          <w:numId w:val="3"/>
+        </w:numPr>
+      </w:pPr>
+      <w:proofErr w:type="spellStart"/>
+      <w:r>
+        <w:t>studyLesson</w:t>
+      </w:r>
+      <w:proofErr w:type="spellEnd"/>
+      <w:r>
+        <w:t xml:space="preserve"> returns Object?. Since it’s really returning either a String (lesson name/message) or null, you could tighten it to String? for clarity.</w:t>
+      </w:r>
+    </w:p>
+    <w:p>
+      <w:r>
+        <w:pict w14:anchorId="084D9BA2">
+          <v:rect id="_x0000_i1054" style="width:0;height:1.5pt" o:hralign="center" o:hrstd="t" o:hr="t" fillcolor="#a0a0a0" stroked="f"/>
+        </w:pict>
+      </w:r>
+    </w:p>
+    <w:p>
+      <w:pPr>
+        <w:rPr>
+          <w:b/>
+          <w:bCs/>
+        </w:rPr>
+      </w:pPr>
+      <w:r>
+        <w:rPr>
+          <w:rFonts w:ascii="Segoe UI Emoji" w:hAnsi="Segoe UI Emoji" w:cs="Segoe UI Emoji"/>
+          <w:b/>
+          <w:bCs/>
+        </w:rPr>
+        <w:lastRenderedPageBreak/>
+        <w:t>🧠</w:t>
+      </w:r>
+      <w:r>
+        <w:rPr>
+          <w:b/>
+          <w:bCs/>
+        </w:rPr>
+        <w:t xml:space="preserve"> Key takeaway</w:t>
+      </w:r>
+    </w:p>
+    <w:p>
+      <w:r>
+        <w:t xml:space="preserve">You’ve built a </w:t>
+      </w:r>
+      <w:r>
+        <w:rPr>
+          <w:b/>
+          <w:bCs/>
+        </w:rPr>
+        <w:t>solid OOP foundation</w:t>
+      </w:r>
+      <w:r>
+        <w:t>:</w:t>
+      </w:r>
+    </w:p>
+    <w:p>
+      <w:pPr>
+        <w:numPr>
+          <w:ilvl w:val="0"/>
+          <w:numId w:val="4"/>
+        </w:numPr>
+      </w:pPr>
+      <w:r>
+        <w:t>Classes for entities (User, Course).</w:t>
+      </w:r>
+    </w:p>
+    <w:p>
+      <w:pPr>
+        <w:numPr>
+          <w:ilvl w:val="0"/>
+          <w:numId w:val="4"/>
+        </w:numPr>
+      </w:pPr>
+      <w:r>
+        <w:t>Maps for state (lessons).</w:t>
+      </w:r>
+    </w:p>
+    <w:p>
+      <w:pPr>
+        <w:numPr>
+          <w:ilvl w:val="0"/>
+          <w:numId w:val="4"/>
+        </w:numPr>
+      </w:pPr>
+      <w:r>
+        <w:t>Methods for behavior (</w:t>
+      </w:r>
+      <w:proofErr w:type="spellStart"/>
+      <w:r>
+        <w:t>studyLesson</w:t>
+      </w:r>
+      <w:proofErr w:type="spellEnd"/>
+      <w:r>
+        <w:t xml:space="preserve">, </w:t>
+      </w:r>
+      <w:proofErr w:type="spellStart"/>
+      <w:r>
+        <w:t>compPercent</w:t>
+      </w:r>
+      <w:proofErr w:type="spellEnd"/>
+      <w:r>
+        <w:t xml:space="preserve">, </w:t>
+      </w:r>
+      <w:proofErr w:type="spellStart"/>
+      <w:r>
+        <w:t>generateReport</w:t>
+      </w:r>
+      <w:proofErr w:type="spellEnd"/>
+      <w:r>
+        <w:t>).</w:t>
+      </w:r>
+    </w:p>
+    <w:p>
+      <w:pPr>
+        <w:numPr>
+          <w:ilvl w:val="0"/>
+          <w:numId w:val="4"/>
+        </w:numPr>
+      </w:pPr>
+      <w:r>
+        <w:t>Separation of concerns (Report handles reporting).</w:t>
+      </w:r>
+    </w:p>
+    <w:p>
+      <w:r>
+        <w:t>This is exactly how you scale toward a real app — clean design, reusable logic, and clear responsibilities.</w:t>
+      </w:r>
+    </w:p>
+    <w:p>
+      <w:r>
+        <w:pict w14:anchorId="24584A87">
+          <v:rect id="_x0000_i1055" style="width:0;height:1.5pt" o:hralign="center" o:hrstd="t" o:hr="t" fillcolor="#a0a0a0" stroked="f"/>
+        </w:pict>
+      </w:r>
+    </w:p>
+    <w:p>
+      <w:r>
+        <w:rPr>
+          <w:rFonts w:ascii="Segoe UI Emoji" w:hAnsi="Segoe UI Emoji" w:cs="Segoe UI Emoji"/>
+        </w:rPr>
+        <w:t>👉</w:t>
+      </w:r>
+      <w:r>
+        <w:t xml:space="preserve"> Want me to sketch how you could </w:t>
+      </w:r>
+      <w:r>
+        <w:rPr>
+          <w:b/>
+          <w:bCs/>
+        </w:rPr>
+        <w:t>refactor lesson completion</w:t>
+      </w:r>
+      <w:r>
+        <w:t xml:space="preserve"> so that </w:t>
+      </w:r>
+      <w:proofErr w:type="spellStart"/>
+      <w:r>
+        <w:t>finCourseLessons</w:t>
+      </w:r>
+      <w:proofErr w:type="spellEnd"/>
+      <w:r>
+        <w:t xml:space="preserve"> is always derived from the lessons map (instead of manually incremented)? That would eliminate the risk of inconsistent progress tracking.</w:t>
+      </w:r>
+    </w:p>
+    <w:p/>
     <w:p/>
     <w:sectPr>
       <w:pgSz w:w="12240" w:h="15840"/>
@@ -587,8 +1190,432 @@
       </w:pPr>
     </w:lvl>
   </w:abstractNum>
+  <w:abstractNum w:abstractNumId="1" w15:restartNumberingAfterBreak="0">
+    <w:nsid w:val="255B4629"/>
+    <w:multiLevelType w:val="multilevel"/>
+    <w:tmpl w:val="B690465E"/>
+    <w:lvl w:ilvl="0">
+      <w:start w:val="1"/>
+      <w:numFmt w:val="bullet"/>
+      <w:lvlText w:val=""/>
+      <w:lvlJc w:val="left"/>
+      <w:pPr>
+        <w:tabs>
+          <w:tab w:val="num" w:pos="720"/>
+        </w:tabs>
+        <w:ind w:left="720" w:hanging="360"/>
+      </w:pPr>
+      <w:rPr>
+        <w:rFonts w:ascii="Symbol" w:hAnsi="Symbol" w:hint="default"/>
+        <w:sz w:val="20"/>
+      </w:rPr>
+    </w:lvl>
+    <w:lvl w:ilvl="1" w:tentative="1">
+      <w:start w:val="1"/>
+      <w:numFmt w:val="bullet"/>
+      <w:lvlText w:val="o"/>
+      <w:lvlJc w:val="left"/>
+      <w:pPr>
+        <w:tabs>
+          <w:tab w:val="num" w:pos="1440"/>
+        </w:tabs>
+        <w:ind w:left="1440" w:hanging="360"/>
+      </w:pPr>
+      <w:rPr>
+        <w:rFonts w:ascii="Courier New" w:hAnsi="Courier New" w:hint="default"/>
+        <w:sz w:val="20"/>
+      </w:rPr>
+    </w:lvl>
+    <w:lvl w:ilvl="2" w:tentative="1">
+      <w:start w:val="1"/>
+      <w:numFmt w:val="bullet"/>
+      <w:lvlText w:val=""/>
+      <w:lvlJc w:val="left"/>
+      <w:pPr>
+        <w:tabs>
+          <w:tab w:val="num" w:pos="2160"/>
+        </w:tabs>
+        <w:ind w:left="2160" w:hanging="360"/>
+      </w:pPr>
+      <w:rPr>
+        <w:rFonts w:ascii="Wingdings" w:hAnsi="Wingdings" w:hint="default"/>
+        <w:sz w:val="20"/>
+      </w:rPr>
+    </w:lvl>
+    <w:lvl w:ilvl="3" w:tentative="1">
+      <w:start w:val="1"/>
+      <w:numFmt w:val="bullet"/>
+      <w:lvlText w:val=""/>
+      <w:lvlJc w:val="left"/>
+      <w:pPr>
+        <w:tabs>
+          <w:tab w:val="num" w:pos="2880"/>
+        </w:tabs>
+        <w:ind w:left="2880" w:hanging="360"/>
+      </w:pPr>
+      <w:rPr>
+        <w:rFonts w:ascii="Wingdings" w:hAnsi="Wingdings" w:hint="default"/>
+        <w:sz w:val="20"/>
+      </w:rPr>
+    </w:lvl>
+    <w:lvl w:ilvl="4" w:tentative="1">
+      <w:start w:val="1"/>
+      <w:numFmt w:val="bullet"/>
+      <w:lvlText w:val=""/>
+      <w:lvlJc w:val="left"/>
+      <w:pPr>
+        <w:tabs>
+          <w:tab w:val="num" w:pos="3600"/>
+        </w:tabs>
+        <w:ind w:left="3600" w:hanging="360"/>
+      </w:pPr>
+      <w:rPr>
+        <w:rFonts w:ascii="Wingdings" w:hAnsi="Wingdings" w:hint="default"/>
+        <w:sz w:val="20"/>
+      </w:rPr>
+    </w:lvl>
+    <w:lvl w:ilvl="5" w:tentative="1">
+      <w:start w:val="1"/>
+      <w:numFmt w:val="bullet"/>
+      <w:lvlText w:val=""/>
+      <w:lvlJc w:val="left"/>
+      <w:pPr>
+        <w:tabs>
+          <w:tab w:val="num" w:pos="4320"/>
+        </w:tabs>
+        <w:ind w:left="4320" w:hanging="360"/>
+      </w:pPr>
+      <w:rPr>
+        <w:rFonts w:ascii="Wingdings" w:hAnsi="Wingdings" w:hint="default"/>
+        <w:sz w:val="20"/>
+      </w:rPr>
+    </w:lvl>
+    <w:lvl w:ilvl="6" w:tentative="1">
+      <w:start w:val="1"/>
+      <w:numFmt w:val="bullet"/>
+      <w:lvlText w:val=""/>
+      <w:lvlJc w:val="left"/>
+      <w:pPr>
+        <w:tabs>
+          <w:tab w:val="num" w:pos="5040"/>
+        </w:tabs>
+        <w:ind w:left="5040" w:hanging="360"/>
+      </w:pPr>
+      <w:rPr>
+        <w:rFonts w:ascii="Wingdings" w:hAnsi="Wingdings" w:hint="default"/>
+        <w:sz w:val="20"/>
+      </w:rPr>
+    </w:lvl>
+    <w:lvl w:ilvl="7" w:tentative="1">
+      <w:start w:val="1"/>
+      <w:numFmt w:val="bullet"/>
+      <w:lvlText w:val=""/>
+      <w:lvlJc w:val="left"/>
+      <w:pPr>
+        <w:tabs>
+          <w:tab w:val="num" w:pos="5760"/>
+        </w:tabs>
+        <w:ind w:left="5760" w:hanging="360"/>
+      </w:pPr>
+      <w:rPr>
+        <w:rFonts w:ascii="Wingdings" w:hAnsi="Wingdings" w:hint="default"/>
+        <w:sz w:val="20"/>
+      </w:rPr>
+    </w:lvl>
+    <w:lvl w:ilvl="8" w:tentative="1">
+      <w:start w:val="1"/>
+      <w:numFmt w:val="bullet"/>
+      <w:lvlText w:val=""/>
+      <w:lvlJc w:val="left"/>
+      <w:pPr>
+        <w:tabs>
+          <w:tab w:val="num" w:pos="6480"/>
+        </w:tabs>
+        <w:ind w:left="6480" w:hanging="360"/>
+      </w:pPr>
+      <w:rPr>
+        <w:rFonts w:ascii="Wingdings" w:hAnsi="Wingdings" w:hint="default"/>
+        <w:sz w:val="20"/>
+      </w:rPr>
+    </w:lvl>
+  </w:abstractNum>
+  <w:abstractNum w:abstractNumId="2" w15:restartNumberingAfterBreak="0">
+    <w:nsid w:val="2F64518B"/>
+    <w:multiLevelType w:val="multilevel"/>
+    <w:tmpl w:val="355207FC"/>
+    <w:lvl w:ilvl="0">
+      <w:start w:val="1"/>
+      <w:numFmt w:val="bullet"/>
+      <w:lvlText w:val=""/>
+      <w:lvlJc w:val="left"/>
+      <w:pPr>
+        <w:tabs>
+          <w:tab w:val="num" w:pos="720"/>
+        </w:tabs>
+        <w:ind w:left="720" w:hanging="360"/>
+      </w:pPr>
+      <w:rPr>
+        <w:rFonts w:ascii="Symbol" w:hAnsi="Symbol" w:hint="default"/>
+        <w:sz w:val="20"/>
+      </w:rPr>
+    </w:lvl>
+    <w:lvl w:ilvl="1" w:tentative="1">
+      <w:start w:val="1"/>
+      <w:numFmt w:val="bullet"/>
+      <w:lvlText w:val="o"/>
+      <w:lvlJc w:val="left"/>
+      <w:pPr>
+        <w:tabs>
+          <w:tab w:val="num" w:pos="1440"/>
+        </w:tabs>
+        <w:ind w:left="1440" w:hanging="360"/>
+      </w:pPr>
+      <w:rPr>
+        <w:rFonts w:ascii="Courier New" w:hAnsi="Courier New" w:hint="default"/>
+        <w:sz w:val="20"/>
+      </w:rPr>
+    </w:lvl>
+    <w:lvl w:ilvl="2" w:tentative="1">
+      <w:start w:val="1"/>
+      <w:numFmt w:val="bullet"/>
+      <w:lvlText w:val=""/>
+      <w:lvlJc w:val="left"/>
+      <w:pPr>
+        <w:tabs>
+          <w:tab w:val="num" w:pos="2160"/>
+        </w:tabs>
+        <w:ind w:left="2160" w:hanging="360"/>
+      </w:pPr>
+      <w:rPr>
+        <w:rFonts w:ascii="Wingdings" w:hAnsi="Wingdings" w:hint="default"/>
+        <w:sz w:val="20"/>
+      </w:rPr>
+    </w:lvl>
+    <w:lvl w:ilvl="3" w:tentative="1">
+      <w:start w:val="1"/>
+      <w:numFmt w:val="bullet"/>
+      <w:lvlText w:val=""/>
+      <w:lvlJc w:val="left"/>
+      <w:pPr>
+        <w:tabs>
+          <w:tab w:val="num" w:pos="2880"/>
+        </w:tabs>
+        <w:ind w:left="2880" w:hanging="360"/>
+      </w:pPr>
+      <w:rPr>
+        <w:rFonts w:ascii="Wingdings" w:hAnsi="Wingdings" w:hint="default"/>
+        <w:sz w:val="20"/>
+      </w:rPr>
+    </w:lvl>
+    <w:lvl w:ilvl="4" w:tentative="1">
+      <w:start w:val="1"/>
+      <w:numFmt w:val="bullet"/>
+      <w:lvlText w:val=""/>
+      <w:lvlJc w:val="left"/>
+      <w:pPr>
+        <w:tabs>
+          <w:tab w:val="num" w:pos="3600"/>
+        </w:tabs>
+        <w:ind w:left="3600" w:hanging="360"/>
+      </w:pPr>
+      <w:rPr>
+        <w:rFonts w:ascii="Wingdings" w:hAnsi="Wingdings" w:hint="default"/>
+        <w:sz w:val="20"/>
+      </w:rPr>
+    </w:lvl>
+    <w:lvl w:ilvl="5" w:tentative="1">
+      <w:start w:val="1"/>
+      <w:numFmt w:val="bullet"/>
+      <w:lvlText w:val=""/>
+      <w:lvlJc w:val="left"/>
+      <w:pPr>
+        <w:tabs>
+          <w:tab w:val="num" w:pos="4320"/>
+        </w:tabs>
+        <w:ind w:left="4320" w:hanging="360"/>
+      </w:pPr>
+      <w:rPr>
+        <w:rFonts w:ascii="Wingdings" w:hAnsi="Wingdings" w:hint="default"/>
+        <w:sz w:val="20"/>
+      </w:rPr>
+    </w:lvl>
+    <w:lvl w:ilvl="6" w:tentative="1">
+      <w:start w:val="1"/>
+      <w:numFmt w:val="bullet"/>
+      <w:lvlText w:val=""/>
+      <w:lvlJc w:val="left"/>
+      <w:pPr>
+        <w:tabs>
+          <w:tab w:val="num" w:pos="5040"/>
+        </w:tabs>
+        <w:ind w:left="5040" w:hanging="360"/>
+      </w:pPr>
+      <w:rPr>
+        <w:rFonts w:ascii="Wingdings" w:hAnsi="Wingdings" w:hint="default"/>
+        <w:sz w:val="20"/>
+      </w:rPr>
+    </w:lvl>
+    <w:lvl w:ilvl="7" w:tentative="1">
+      <w:start w:val="1"/>
+      <w:numFmt w:val="bullet"/>
+      <w:lvlText w:val=""/>
+      <w:lvlJc w:val="left"/>
+      <w:pPr>
+        <w:tabs>
+          <w:tab w:val="num" w:pos="5760"/>
+        </w:tabs>
+        <w:ind w:left="5760" w:hanging="360"/>
+      </w:pPr>
+      <w:rPr>
+        <w:rFonts w:ascii="Wingdings" w:hAnsi="Wingdings" w:hint="default"/>
+        <w:sz w:val="20"/>
+      </w:rPr>
+    </w:lvl>
+    <w:lvl w:ilvl="8" w:tentative="1">
+      <w:start w:val="1"/>
+      <w:numFmt w:val="bullet"/>
+      <w:lvlText w:val=""/>
+      <w:lvlJc w:val="left"/>
+      <w:pPr>
+        <w:tabs>
+          <w:tab w:val="num" w:pos="6480"/>
+        </w:tabs>
+        <w:ind w:left="6480" w:hanging="360"/>
+      </w:pPr>
+      <w:rPr>
+        <w:rFonts w:ascii="Wingdings" w:hAnsi="Wingdings" w:hint="default"/>
+        <w:sz w:val="20"/>
+      </w:rPr>
+    </w:lvl>
+  </w:abstractNum>
+  <w:abstractNum w:abstractNumId="3" w15:restartNumberingAfterBreak="0">
+    <w:nsid w:val="4912032C"/>
+    <w:multiLevelType w:val="multilevel"/>
+    <w:tmpl w:val="E25EEE3C"/>
+    <w:lvl w:ilvl="0">
+      <w:start w:val="1"/>
+      <w:numFmt w:val="decimal"/>
+      <w:lvlText w:val="%1."/>
+      <w:lvlJc w:val="left"/>
+      <w:pPr>
+        <w:tabs>
+          <w:tab w:val="num" w:pos="720"/>
+        </w:tabs>
+        <w:ind w:left="720" w:hanging="360"/>
+      </w:pPr>
+    </w:lvl>
+    <w:lvl w:ilvl="1">
+      <w:start w:val="1"/>
+      <w:numFmt w:val="bullet"/>
+      <w:lvlText w:val="o"/>
+      <w:lvlJc w:val="left"/>
+      <w:pPr>
+        <w:tabs>
+          <w:tab w:val="num" w:pos="1440"/>
+        </w:tabs>
+        <w:ind w:left="1440" w:hanging="360"/>
+      </w:pPr>
+      <w:rPr>
+        <w:rFonts w:ascii="Courier New" w:hAnsi="Courier New" w:hint="default"/>
+        <w:sz w:val="20"/>
+      </w:rPr>
+    </w:lvl>
+    <w:lvl w:ilvl="2" w:tentative="1">
+      <w:start w:val="1"/>
+      <w:numFmt w:val="decimal"/>
+      <w:lvlText w:val="%3."/>
+      <w:lvlJc w:val="left"/>
+      <w:pPr>
+        <w:tabs>
+          <w:tab w:val="num" w:pos="2160"/>
+        </w:tabs>
+        <w:ind w:left="2160" w:hanging="360"/>
+      </w:pPr>
+    </w:lvl>
+    <w:lvl w:ilvl="3" w:tentative="1">
+      <w:start w:val="1"/>
+      <w:numFmt w:val="decimal"/>
+      <w:lvlText w:val="%4."/>
+      <w:lvlJc w:val="left"/>
+      <w:pPr>
+        <w:tabs>
+          <w:tab w:val="num" w:pos="2880"/>
+        </w:tabs>
+        <w:ind w:left="2880" w:hanging="360"/>
+      </w:pPr>
+    </w:lvl>
+    <w:lvl w:ilvl="4" w:tentative="1">
+      <w:start w:val="1"/>
+      <w:numFmt w:val="decimal"/>
+      <w:lvlText w:val="%5."/>
+      <w:lvlJc w:val="left"/>
+      <w:pPr>
+        <w:tabs>
+          <w:tab w:val="num" w:pos="3600"/>
+        </w:tabs>
+        <w:ind w:left="3600" w:hanging="360"/>
+      </w:pPr>
+    </w:lvl>
+    <w:lvl w:ilvl="5" w:tentative="1">
+      <w:start w:val="1"/>
+      <w:numFmt w:val="decimal"/>
+      <w:lvlText w:val="%6."/>
+      <w:lvlJc w:val="left"/>
+      <w:pPr>
+        <w:tabs>
+          <w:tab w:val="num" w:pos="4320"/>
+        </w:tabs>
+        <w:ind w:left="4320" w:hanging="360"/>
+      </w:pPr>
+    </w:lvl>
+    <w:lvl w:ilvl="6" w:tentative="1">
+      <w:start w:val="1"/>
+      <w:numFmt w:val="decimal"/>
+      <w:lvlText w:val="%7."/>
+      <w:lvlJc w:val="left"/>
+      <w:pPr>
+        <w:tabs>
+          <w:tab w:val="num" w:pos="5040"/>
+        </w:tabs>
+        <w:ind w:left="5040" w:hanging="360"/>
+      </w:pPr>
+    </w:lvl>
+    <w:lvl w:ilvl="7" w:tentative="1">
+      <w:start w:val="1"/>
+      <w:numFmt w:val="decimal"/>
+      <w:lvlText w:val="%8."/>
+      <w:lvlJc w:val="left"/>
+      <w:pPr>
+        <w:tabs>
+          <w:tab w:val="num" w:pos="5760"/>
+        </w:tabs>
+        <w:ind w:left="5760" w:hanging="360"/>
+      </w:pPr>
+    </w:lvl>
+    <w:lvl w:ilvl="8" w:tentative="1">
+      <w:start w:val="1"/>
+      <w:numFmt w:val="decimal"/>
+      <w:lvlText w:val="%9."/>
+      <w:lvlJc w:val="left"/>
+      <w:pPr>
+        <w:tabs>
+          <w:tab w:val="num" w:pos="6480"/>
+        </w:tabs>
+        <w:ind w:left="6480" w:hanging="360"/>
+      </w:pPr>
+    </w:lvl>
+  </w:abstractNum>
   <w:num w:numId="1" w16cid:durableId="1706563159">
     <w:abstractNumId w:val="0"/>
+  </w:num>
+  <w:num w:numId="2" w16cid:durableId="1611204573">
+    <w:abstractNumId w:val="2"/>
+  </w:num>
+  <w:num w:numId="3" w16cid:durableId="486748290">
+    <w:abstractNumId w:val="3"/>
+  </w:num>
+  <w:num w:numId="4" w16cid:durableId="40832755">
+    <w:abstractNumId w:val="1"/>
   </w:num>
 </w:numbering>
 </file>

</xml_diff>

<commit_message>
fixing mixins & working on the points in copilot feedback 1
</commit_message>
<xml_diff>
--- a/Practice Idea - Learning Hub App.docx
+++ b/Practice Idea - Learning Hub App.docx
@@ -492,7 +492,7 @@
     <w:p>
       <w:r>
         <w:pict w14:anchorId="45EB6333">
-          <v:rect id="_x0000_i1052" style="width:0;height:1.5pt" o:hralign="center" o:hrstd="t" o:hr="t" fillcolor="#a0a0a0" stroked="f"/>
+          <v:rect id="_x0000_i1028" style="width:0;height:1.5pt" o:hralign="center" o:hrstd="t" o:hr="t" fillcolor="#a0a0a0" stroked="f"/>
         </w:pict>
       </w:r>
     </w:p>
@@ -647,7 +647,7 @@
     <w:p>
       <w:r>
         <w:pict w14:anchorId="72497D02">
-          <v:rect id="_x0000_i1053" style="width:0;height:1.5pt" o:hralign="center" o:hrstd="t" o:hr="t" fillcolor="#a0a0a0" stroked="f"/>
+          <v:rect id="_x0000_i1029" style="width:0;height:1.5pt" o:hralign="center" o:hrstd="t" o:hr="t" fillcolor="#a0a0a0" stroked="f"/>
         </w:pict>
       </w:r>
     </w:p>
@@ -907,7 +907,7 @@
     <w:p>
       <w:r>
         <w:pict w14:anchorId="084D9BA2">
-          <v:rect id="_x0000_i1054" style="width:0;height:1.5pt" o:hralign="center" o:hrstd="t" o:hr="t" fillcolor="#a0a0a0" stroked="f"/>
+          <v:rect id="_x0000_i1030" style="width:0;height:1.5pt" o:hralign="center" o:hrstd="t" o:hr="t" fillcolor="#a0a0a0" stroked="f"/>
         </w:pict>
       </w:r>
     </w:p>
@@ -1026,7 +1026,7 @@
     <w:p>
       <w:r>
         <w:pict w14:anchorId="24584A87">
-          <v:rect id="_x0000_i1055" style="width:0;height:1.5pt" o:hralign="center" o:hrstd="t" o:hr="t" fillcolor="#a0a0a0" stroked="f"/>
+          <v:rect id="_x0000_i1031" style="width:0;height:1.5pt" o:hralign="center" o:hrstd="t" o:hr="t" fillcolor="#a0a0a0" stroked="f"/>
         </w:pict>
       </w:r>
     </w:p>
@@ -1059,6 +1059,779 @@
         <w:t xml:space="preserve"> is always derived from the lessons map (instead of manually incremented)? That would eliminate the risk of inconsistent progress tracking.</w:t>
       </w:r>
     </w:p>
+    <w:p/>
+    <w:p>
+      <w:pPr>
+        <w:pStyle w:val="Title"/>
+        <w:pBdr>
+          <w:bottom w:val="single" w:sz="4" w:space="1" w:color="auto"/>
+        </w:pBdr>
+      </w:pPr>
+      <w:r>
+        <w:t>CoPilot Feedback 2:</w:t>
+      </w:r>
+    </w:p>
+    <w:p/>
+    <w:p>
+      <w:r>
+        <w:t xml:space="preserve">Yostina, this is looking really strong </w:t>
+      </w:r>
+      <w:r>
+        <w:rPr>
+          <w:rFonts w:ascii="Segoe UI Emoji" w:hAnsi="Segoe UI Emoji" w:cs="Segoe UI Emoji"/>
+        </w:rPr>
+        <w:t>👏</w:t>
+      </w:r>
+      <w:r>
+        <w:t xml:space="preserve"> — you’ve clearly taken the feedback from yesterday and tightened things up. Let me give you a structured review of your updated Learning Hub code:</w:t>
+      </w:r>
+    </w:p>
+    <w:p>
+      <w:r>
+        <w:pict w14:anchorId="1C0A9F82">
+          <v:rect id="_x0000_i1056" style="width:0;height:1.5pt" o:hralign="center" o:hrstd="t" o:hr="t" fillcolor="#a0a0a0" stroked="f"/>
+        </w:pict>
+      </w:r>
+    </w:p>
+    <w:p>
+      <w:pPr>
+        <w:rPr>
+          <w:b/>
+          <w:bCs/>
+        </w:rPr>
+      </w:pPr>
+      <w:r>
+        <w:rPr>
+          <w:rFonts w:ascii="Segoe UI Emoji" w:hAnsi="Segoe UI Emoji" w:cs="Segoe UI Emoji"/>
+          <w:b/>
+          <w:bCs/>
+        </w:rPr>
+        <w:t>✅</w:t>
+      </w:r>
+      <w:r>
+        <w:rPr>
+          <w:b/>
+          <w:bCs/>
+        </w:rPr>
+        <w:t xml:space="preserve"> Improvements I see</w:t>
+      </w:r>
+    </w:p>
+    <w:p>
+      <w:pPr>
+        <w:numPr>
+          <w:ilvl w:val="0"/>
+          <w:numId w:val="5"/>
+        </w:numPr>
+      </w:pPr>
+      <w:proofErr w:type="spellStart"/>
+      <w:r>
+        <w:rPr>
+          <w:b/>
+          <w:bCs/>
+        </w:rPr>
+        <w:t>Mixin</w:t>
+      </w:r>
+      <w:proofErr w:type="spellEnd"/>
+      <w:r>
+        <w:rPr>
+          <w:b/>
+          <w:bCs/>
+        </w:rPr>
+        <w:t xml:space="preserve"> </w:t>
+      </w:r>
+      <w:proofErr w:type="spellStart"/>
+      <w:r>
+        <w:rPr>
+          <w:b/>
+          <w:bCs/>
+        </w:rPr>
+        <w:t>LoginLogout</w:t>
+      </w:r>
+      <w:proofErr w:type="spellEnd"/>
+      <w:r>
+        <w:t>: You solved the email/</w:t>
+      </w:r>
+      <w:proofErr w:type="spellStart"/>
+      <w:r>
+        <w:t>pwd</w:t>
+      </w:r>
+      <w:proofErr w:type="spellEnd"/>
+      <w:r>
+        <w:t xml:space="preserve"> issue with abstract getters — now </w:t>
+      </w:r>
+      <w:proofErr w:type="spellStart"/>
+      <w:r>
+        <w:t>RegularUser</w:t>
+      </w:r>
+      <w:proofErr w:type="spellEnd"/>
+      <w:r>
+        <w:t xml:space="preserve"> and </w:t>
+      </w:r>
+      <w:proofErr w:type="spellStart"/>
+      <w:r>
+        <w:t>AdminUser</w:t>
+      </w:r>
+      <w:proofErr w:type="spellEnd"/>
+      <w:r>
+        <w:t xml:space="preserve"> properly override them. That’s the clean, reusable approach.</w:t>
+      </w:r>
+    </w:p>
+    <w:p>
+      <w:pPr>
+        <w:numPr>
+          <w:ilvl w:val="0"/>
+          <w:numId w:val="5"/>
+        </w:numPr>
+      </w:pPr>
+      <w:proofErr w:type="spellStart"/>
+      <w:r>
+        <w:rPr>
+          <w:b/>
+          <w:bCs/>
+        </w:rPr>
+        <w:t>StudyLesson</w:t>
+      </w:r>
+      <w:proofErr w:type="spellEnd"/>
+      <w:r>
+        <w:rPr>
+          <w:b/>
+          <w:bCs/>
+        </w:rPr>
+        <w:t xml:space="preserve"> logic</w:t>
+      </w:r>
+      <w:r>
+        <w:t>: You’re now updating the lessons map directly (</w:t>
+      </w:r>
+      <w:proofErr w:type="spellStart"/>
+      <w:r>
+        <w:t>course.lessons</w:t>
+      </w:r>
+      <w:proofErr w:type="spellEnd"/>
+      <w:r>
+        <w:t>[</w:t>
+      </w:r>
+      <w:proofErr w:type="spellStart"/>
+      <w:r>
+        <w:t>lesson.key</w:t>
+      </w:r>
+      <w:proofErr w:type="spellEnd"/>
+      <w:r>
+        <w:t>] = true) instead of just incrementing counters. That’s much safer and avoids double</w:t>
+      </w:r>
+      <w:r>
+        <w:noBreakHyphen/>
+        <w:t>counting.</w:t>
+      </w:r>
+    </w:p>
+    <w:p>
+      <w:pPr>
+        <w:numPr>
+          <w:ilvl w:val="0"/>
+          <w:numId w:val="5"/>
+        </w:numPr>
+      </w:pPr>
+      <w:r>
+        <w:rPr>
+          <w:b/>
+          <w:bCs/>
+        </w:rPr>
+        <w:lastRenderedPageBreak/>
+        <w:t>Milestone notifications</w:t>
+      </w:r>
+      <w:r>
+        <w:t>: Switching to ranges (&gt;= 25 &amp;&amp; &lt; 50) instead of exact equality is a smart fix for floating</w:t>
+      </w:r>
+      <w:r>
+        <w:noBreakHyphen/>
+        <w:t>point precision issues.</w:t>
+      </w:r>
+    </w:p>
+    <w:p>
+      <w:pPr>
+        <w:numPr>
+          <w:ilvl w:val="0"/>
+          <w:numId w:val="5"/>
+        </w:numPr>
+      </w:pPr>
+      <w:r>
+        <w:rPr>
+          <w:b/>
+          <w:bCs/>
+        </w:rPr>
+        <w:t>Report class</w:t>
+      </w:r>
+      <w:r>
+        <w:t>: Clean separation — User passes itself, Report handles the summary. Nice design.</w:t>
+      </w:r>
+    </w:p>
+    <w:p>
+      <w:r>
+        <w:pict w14:anchorId="5E96057B">
+          <v:rect id="_x0000_i1057" style="width:0;height:1.5pt" o:hralign="center" o:hrstd="t" o:hr="t" fillcolor="#a0a0a0" stroked="f"/>
+        </w:pict>
+      </w:r>
+    </w:p>
+    <w:p>
+      <w:pPr>
+        <w:rPr>
+          <w:b/>
+          <w:bCs/>
+        </w:rPr>
+      </w:pPr>
+      <w:r>
+        <w:rPr>
+          <w:rFonts w:ascii="Segoe UI Emoji" w:hAnsi="Segoe UI Emoji" w:cs="Segoe UI Emoji"/>
+          <w:b/>
+          <w:bCs/>
+        </w:rPr>
+        <w:t>⚠️</w:t>
+      </w:r>
+      <w:r>
+        <w:rPr>
+          <w:b/>
+          <w:bCs/>
+        </w:rPr>
+        <w:t xml:space="preserve"> Notes for refinement</w:t>
+      </w:r>
+    </w:p>
+    <w:p>
+      <w:pPr>
+        <w:numPr>
+          <w:ilvl w:val="0"/>
+          <w:numId w:val="6"/>
+        </w:numPr>
+      </w:pPr>
+      <w:r>
+        <w:rPr>
+          <w:b/>
+          <w:bCs/>
+        </w:rPr>
+        <w:t>Recursive login/logout calls</w:t>
+      </w:r>
+      <w:r>
+        <w:t xml:space="preserve"> </w:t>
+      </w:r>
+      <w:r>
+        <w:br/>
+        <w:t xml:space="preserve">In </w:t>
+      </w:r>
+      <w:proofErr w:type="spellStart"/>
+      <w:r>
+        <w:t>RegularUser</w:t>
+      </w:r>
+      <w:proofErr w:type="spellEnd"/>
+      <w:r>
+        <w:t xml:space="preserve"> and </w:t>
+      </w:r>
+      <w:proofErr w:type="spellStart"/>
+      <w:r>
+        <w:t>AdminUser</w:t>
+      </w:r>
+      <w:proofErr w:type="spellEnd"/>
+      <w:r>
+        <w:t>, you wrote:</w:t>
+      </w:r>
+    </w:p>
+    <w:p>
+      <w:pPr>
+        <w:numPr>
+          <w:ilvl w:val="0"/>
+          <w:numId w:val="6"/>
+        </w:numPr>
+        <w:tabs>
+          <w:tab w:val="clear" w:pos="720"/>
+        </w:tabs>
+      </w:pPr>
+      <w:r>
+        <w:t xml:space="preserve">void </w:t>
+      </w:r>
+      <w:proofErr w:type="spellStart"/>
+      <w:r>
+        <w:t>logIn</w:t>
+      </w:r>
+      <w:proofErr w:type="spellEnd"/>
+      <w:r>
+        <w:t xml:space="preserve">(String email, String </w:t>
+      </w:r>
+      <w:proofErr w:type="spellStart"/>
+      <w:r>
+        <w:t>pwd</w:t>
+      </w:r>
+      <w:proofErr w:type="spellEnd"/>
+      <w:r>
+        <w:t>){</w:t>
+      </w:r>
+    </w:p>
+    <w:p>
+      <w:pPr>
+        <w:numPr>
+          <w:ilvl w:val="0"/>
+          <w:numId w:val="6"/>
+        </w:numPr>
+        <w:tabs>
+          <w:tab w:val="clear" w:pos="720"/>
+        </w:tabs>
+      </w:pPr>
+      <w:r>
+        <w:t xml:space="preserve">  </w:t>
+      </w:r>
+      <w:proofErr w:type="spellStart"/>
+      <w:r>
+        <w:t>logIn</w:t>
+      </w:r>
+      <w:proofErr w:type="spellEnd"/>
+      <w:r>
+        <w:t xml:space="preserve">(email, </w:t>
+      </w:r>
+      <w:proofErr w:type="spellStart"/>
+      <w:r>
+        <w:t>pwd</w:t>
+      </w:r>
+      <w:proofErr w:type="spellEnd"/>
+      <w:r>
+        <w:t>);</w:t>
+      </w:r>
+    </w:p>
+    <w:p>
+      <w:pPr>
+        <w:numPr>
+          <w:ilvl w:val="0"/>
+          <w:numId w:val="6"/>
+        </w:numPr>
+        <w:tabs>
+          <w:tab w:val="clear" w:pos="720"/>
+        </w:tabs>
+      </w:pPr>
+      <w:r>
+        <w:t>}</w:t>
+      </w:r>
+    </w:p>
+    <w:p>
+      <w:r>
+        <w:t xml:space="preserve">That’s actually calling itself recursively forever. What you want is to call the </w:t>
+      </w:r>
+      <w:proofErr w:type="spellStart"/>
+      <w:r>
+        <w:t>mixin’s</w:t>
+      </w:r>
+      <w:proofErr w:type="spellEnd"/>
+      <w:r>
+        <w:t xml:space="preserve"> login method:</w:t>
+      </w:r>
+    </w:p>
+    <w:p>
+      <w:r>
+        <w:t xml:space="preserve">void </w:t>
+      </w:r>
+      <w:proofErr w:type="spellStart"/>
+      <w:r>
+        <w:t>logIn</w:t>
+      </w:r>
+      <w:proofErr w:type="spellEnd"/>
+      <w:r>
+        <w:t xml:space="preserve">(String email, String </w:t>
+      </w:r>
+      <w:proofErr w:type="spellStart"/>
+      <w:r>
+        <w:t>pwd</w:t>
+      </w:r>
+      <w:proofErr w:type="spellEnd"/>
+      <w:r>
+        <w:t>){</w:t>
+      </w:r>
+    </w:p>
+    <w:p>
+      <w:r>
+        <w:t xml:space="preserve">  login(email, </w:t>
+      </w:r>
+      <w:proofErr w:type="spellStart"/>
+      <w:r>
+        <w:t>pwd</w:t>
+      </w:r>
+      <w:proofErr w:type="spellEnd"/>
+      <w:r>
+        <w:t xml:space="preserve">); // lowercase 'login' from </w:t>
+      </w:r>
+      <w:proofErr w:type="spellStart"/>
+      <w:r>
+        <w:t>mixin</w:t>
+      </w:r>
+      <w:proofErr w:type="spellEnd"/>
+    </w:p>
+    <w:p>
+      <w:r>
+        <w:t>}</w:t>
+      </w:r>
+    </w:p>
+    <w:p>
+      <w:r>
+        <w:t xml:space="preserve">Same for </w:t>
+      </w:r>
+      <w:proofErr w:type="spellStart"/>
+      <w:r>
+        <w:t>logOut</w:t>
+      </w:r>
+      <w:proofErr w:type="spellEnd"/>
+      <w:r>
+        <w:t xml:space="preserve">() → call logout() from the </w:t>
+      </w:r>
+      <w:proofErr w:type="spellStart"/>
+      <w:r>
+        <w:t>mixin</w:t>
+      </w:r>
+      <w:proofErr w:type="spellEnd"/>
+      <w:r>
+        <w:t>, not itself.</w:t>
+      </w:r>
+    </w:p>
+    <w:p>
+      <w:pPr>
+        <w:numPr>
+          <w:ilvl w:val="0"/>
+          <w:numId w:val="6"/>
+        </w:numPr>
+      </w:pPr>
+      <w:r>
+        <w:rPr>
+          <w:b/>
+          <w:bCs/>
+        </w:rPr>
+        <w:t>Finished lessons counter</w:t>
+      </w:r>
+      <w:r>
+        <w:t xml:space="preserve"> </w:t>
+      </w:r>
+      <w:r>
+        <w:br/>
+        <w:t xml:space="preserve">Your </w:t>
+      </w:r>
+      <w:proofErr w:type="spellStart"/>
+      <w:r>
+        <w:t>countFinishedLessons</w:t>
+      </w:r>
+      <w:proofErr w:type="spellEnd"/>
+      <w:r>
+        <w:t xml:space="preserve">() currently increments </w:t>
+      </w:r>
+      <w:proofErr w:type="spellStart"/>
+      <w:r>
+        <w:t>finCourseLessons</w:t>
+      </w:r>
+      <w:proofErr w:type="spellEnd"/>
+      <w:r>
+        <w:t xml:space="preserve"> every time it finds a true. But if you call it multiple times, it will keep adding. Better to </w:t>
+      </w:r>
+      <w:r>
+        <w:rPr>
+          <w:b/>
+          <w:bCs/>
+        </w:rPr>
+        <w:t>reset</w:t>
+      </w:r>
+      <w:r>
+        <w:t xml:space="preserve"> before counting, or compute dynamically from the map.</w:t>
+      </w:r>
+    </w:p>
+    <w:p>
+      <w:pPr>
+        <w:numPr>
+          <w:ilvl w:val="0"/>
+          <w:numId w:val="6"/>
+        </w:numPr>
+      </w:pPr>
+      <w:r>
+        <w:rPr>
+          <w:b/>
+          <w:bCs/>
+        </w:rPr>
+        <w:t>Naming consistency</w:t>
+      </w:r>
+    </w:p>
+    <w:p>
+      <w:pPr>
+        <w:numPr>
+          <w:ilvl w:val="1"/>
+          <w:numId w:val="6"/>
+        </w:numPr>
+      </w:pPr>
+      <w:proofErr w:type="spellStart"/>
+      <w:r>
+        <w:t>logIn</w:t>
+      </w:r>
+      <w:proofErr w:type="spellEnd"/>
+      <w:r>
+        <w:t xml:space="preserve"> vs login → unify casing.</w:t>
+      </w:r>
+    </w:p>
+    <w:p>
+      <w:pPr>
+        <w:numPr>
+          <w:ilvl w:val="1"/>
+          <w:numId w:val="6"/>
+        </w:numPr>
+      </w:pPr>
+      <w:proofErr w:type="spellStart"/>
+      <w:r>
+        <w:t>describ</w:t>
+      </w:r>
+      <w:proofErr w:type="spellEnd"/>
+      <w:r>
+        <w:t xml:space="preserve"> in Course → should be description for clarity.</w:t>
+      </w:r>
+    </w:p>
+    <w:p>
+      <w:pPr>
+        <w:numPr>
+          <w:ilvl w:val="0"/>
+          <w:numId w:val="6"/>
+        </w:numPr>
+      </w:pPr>
+      <w:r>
+        <w:rPr>
+          <w:b/>
+          <w:bCs/>
+        </w:rPr>
+        <w:t xml:space="preserve">Return in </w:t>
+      </w:r>
+      <w:proofErr w:type="spellStart"/>
+      <w:r>
+        <w:rPr>
+          <w:b/>
+          <w:bCs/>
+        </w:rPr>
+        <w:t>studyLesson</w:t>
+      </w:r>
+      <w:proofErr w:type="spellEnd"/>
+      <w:r>
+        <w:t xml:space="preserve"> </w:t>
+      </w:r>
+      <w:r>
+        <w:br/>
+        <w:t>You left a comment:</w:t>
+      </w:r>
+    </w:p>
+    <w:p>
+      <w:pPr>
+        <w:numPr>
+          <w:ilvl w:val="0"/>
+          <w:numId w:val="6"/>
+        </w:numPr>
+        <w:tabs>
+          <w:tab w:val="clear" w:pos="720"/>
+        </w:tabs>
+      </w:pPr>
+      <w:r>
+        <w:lastRenderedPageBreak/>
+        <w:t xml:space="preserve">return </w:t>
+      </w:r>
+      <w:proofErr w:type="spellStart"/>
+      <w:r>
+        <w:t>lesson.key</w:t>
+      </w:r>
+      <w:proofErr w:type="spellEnd"/>
+      <w:r>
+        <w:t>; // figure out a way to return first before the previous logic.</w:t>
+      </w:r>
+    </w:p>
+    <w:p>
+      <w:r>
+        <w:t>Right now it works fine — it returns the first unfinished lesson. If you want to process logic before returning, you’d need to restructure slightly, but the current approach is valid.</w:t>
+      </w:r>
+    </w:p>
+    <w:p>
+      <w:r>
+        <w:pict w14:anchorId="3C5D35EC">
+          <v:rect id="_x0000_i1058" style="width:0;height:1.5pt" o:hralign="center" o:hrstd="t" o:hr="t" fillcolor="#a0a0a0" stroked="f"/>
+        </w:pict>
+      </w:r>
+    </w:p>
+    <w:p>
+      <w:pPr>
+        <w:rPr>
+          <w:b/>
+          <w:bCs/>
+        </w:rPr>
+      </w:pPr>
+      <w:r>
+        <w:rPr>
+          <w:rFonts w:ascii="Segoe UI Emoji" w:hAnsi="Segoe UI Emoji" w:cs="Segoe UI Emoji"/>
+          <w:b/>
+          <w:bCs/>
+        </w:rPr>
+        <w:t>🧠</w:t>
+      </w:r>
+      <w:r>
+        <w:rPr>
+          <w:b/>
+          <w:bCs/>
+        </w:rPr>
+        <w:t xml:space="preserve"> Big picture</w:t>
+      </w:r>
+    </w:p>
+    <w:p>
+      <w:r>
+        <w:t>You’ve now got:</w:t>
+      </w:r>
+    </w:p>
+    <w:p>
+      <w:pPr>
+        <w:numPr>
+          <w:ilvl w:val="0"/>
+          <w:numId w:val="7"/>
+        </w:numPr>
+      </w:pPr>
+      <w:r>
+        <w:t xml:space="preserve">A </w:t>
+      </w:r>
+      <w:r>
+        <w:rPr>
+          <w:b/>
+          <w:bCs/>
+        </w:rPr>
+        <w:t xml:space="preserve">solid </w:t>
+      </w:r>
+      <w:proofErr w:type="spellStart"/>
+      <w:r>
+        <w:rPr>
+          <w:b/>
+          <w:bCs/>
+        </w:rPr>
+        <w:t>mixin</w:t>
+      </w:r>
+      <w:proofErr w:type="spellEnd"/>
+      <w:r>
+        <w:t xml:space="preserve"> for login/logout.</w:t>
+      </w:r>
+    </w:p>
+    <w:p>
+      <w:pPr>
+        <w:numPr>
+          <w:ilvl w:val="0"/>
+          <w:numId w:val="7"/>
+        </w:numPr>
+      </w:pPr>
+      <w:r>
+        <w:t xml:space="preserve">A </w:t>
+      </w:r>
+      <w:r>
+        <w:rPr>
+          <w:b/>
+          <w:bCs/>
+        </w:rPr>
+        <w:t>User hierarchy</w:t>
+      </w:r>
+      <w:r>
+        <w:t xml:space="preserve"> with clear roles.</w:t>
+      </w:r>
+    </w:p>
+    <w:p>
+      <w:pPr>
+        <w:numPr>
+          <w:ilvl w:val="0"/>
+          <w:numId w:val="7"/>
+        </w:numPr>
+      </w:pPr>
+      <w:r>
+        <w:t xml:space="preserve">A </w:t>
+      </w:r>
+      <w:r>
+        <w:rPr>
+          <w:b/>
+          <w:bCs/>
+        </w:rPr>
+        <w:t>Course class</w:t>
+      </w:r>
+      <w:r>
+        <w:t xml:space="preserve"> that tracks lessons and progress.</w:t>
+      </w:r>
+    </w:p>
+    <w:p>
+      <w:pPr>
+        <w:numPr>
+          <w:ilvl w:val="0"/>
+          <w:numId w:val="7"/>
+        </w:numPr>
+      </w:pPr>
+      <w:r>
+        <w:t xml:space="preserve">A </w:t>
+      </w:r>
+      <w:r>
+        <w:rPr>
+          <w:b/>
+          <w:bCs/>
+        </w:rPr>
+        <w:t>Report class</w:t>
+      </w:r>
+      <w:r>
+        <w:t xml:space="preserve"> that summarizes user activity.</w:t>
+      </w:r>
+    </w:p>
+    <w:p>
+      <w:r>
+        <w:t>This is a complete OOP learning project — exactly the kind of repo worth sharing to show your journey.</w:t>
+      </w:r>
+    </w:p>
+    <w:p>
+      <w:r>
+        <w:pict w14:anchorId="5EEA6A56">
+          <v:rect id="_x0000_i1059" style="width:0;height:1.5pt" o:hralign="center" o:hrstd="t" o:hr="t" fillcolor="#a0a0a0" stroked="f"/>
+        </w:pict>
+      </w:r>
+    </w:p>
+    <w:p>
+      <w:r>
+        <w:rPr>
+          <w:rFonts w:ascii="Segoe UI Emoji" w:hAnsi="Segoe UI Emoji" w:cs="Segoe UI Emoji"/>
+        </w:rPr>
+        <w:t>👉</w:t>
+      </w:r>
+      <w:r>
+        <w:t xml:space="preserve"> Since you already thought about adding a </w:t>
+      </w:r>
+      <w:r>
+        <w:rPr>
+          <w:b/>
+          <w:bCs/>
+        </w:rPr>
+        <w:t>total finished lessons counter</w:t>
+      </w:r>
+      <w:r>
+        <w:t xml:space="preserve">, I won’t tell you how to do it </w:t>
+      </w:r>
+      <w:r>
+        <w:rPr>
+          <w:rFonts w:ascii="Segoe UI Emoji" w:hAnsi="Segoe UI Emoji" w:cs="Segoe UI Emoji"/>
+        </w:rPr>
+        <w:t>😉</w:t>
+      </w:r>
+      <w:r>
+        <w:t xml:space="preserve"> — but I will say: it’s a natural next step, and it will make your reports even more useful.</w:t>
+      </w:r>
+    </w:p>
+    <w:p>
+      <w:r>
+        <w:t xml:space="preserve">Would you like me to sketch how your </w:t>
+      </w:r>
+      <w:r>
+        <w:rPr>
+          <w:b/>
+          <w:bCs/>
+        </w:rPr>
+        <w:t>Report output could look with per</w:t>
+      </w:r>
+      <w:r>
+        <w:rPr>
+          <w:b/>
+          <w:bCs/>
+        </w:rPr>
+        <w:noBreakHyphen/>
+        <w:t>course progress percentages</w:t>
+      </w:r>
+      <w:r>
+        <w:t xml:space="preserve"> (like: “Course X: 50% complete”), so you can see how the reporting scales beyond just totals?</w:t>
+      </w:r>
+    </w:p>
+    <w:p/>
     <w:p/>
     <w:p/>
     <w:sectPr>
@@ -1074,6 +1847,155 @@
 <file path=word/numbering.xml><?xml version="1.0" encoding="utf-8"?>
 <w:numbering xmlns:wpc="http://schemas.microsoft.com/office/word/2010/wordprocessingCanvas" xmlns:cx="http://schemas.microsoft.com/office/drawing/2014/chartex" xmlns:cx1="http://schemas.microsoft.com/office/drawing/2015/9/8/chartex" xmlns:cx2="http://schemas.microsoft.com/office/drawing/2015/10/21/chartex" xmlns:cx3="http://schemas.microsoft.com/office/drawing/2016/5/9/chartex" xmlns:cx4="http://schemas.microsoft.com/office/drawing/2016/5/10/chartex" xmlns:cx5="http://schemas.microsoft.com/office/drawing/2016/5/11/chartex" xmlns:cx6="http://schemas.microsoft.com/office/drawing/2016/5/12/chartex" xmlns:cx7="http://schemas.microsoft.com/office/drawing/2016/5/13/chartex" xmlns:cx8="http://schemas.microsoft.com/office/drawing/2016/5/14/chartex" xmlns:mc="http://schemas.openxmlformats.org/markup-compatibility/2006" xmlns:aink="http://schemas.microsoft.com/office/drawing/2016/ink" xmlns:am3d="http://schemas.microsoft.com/office/drawing/2017/model3d" xmlns:o="urn:schemas-microsoft-com:office:office" xmlns:oel="http://schemas.microsoft.com/office/2019/extlst" xmlns:r="http://schemas.openxmlformats.org/officeDocument/2006/relationships" xmlns:m="http://schemas.openxmlformats.org/officeDocument/2006/math" xmlns:v="urn:schemas-microsoft-com:vml" xmlns:wp14="http://schemas.microsoft.com/office/word/2010/wordprocessingDrawing" xmlns:wp="http://schemas.openxmlformats.org/drawingml/2006/wordprocessingDrawing" xmlns:w10="urn:schemas-microsoft-com:office:word" xmlns:w="http://schemas.openxmlformats.org/wordprocessingml/2006/main" xmlns:w14="http://schemas.microsoft.com/office/word/2010/wordml" xmlns:w15="http://schemas.microsoft.com/office/word/2012/wordml" xmlns:w16cex="http://schemas.microsoft.com/office/word/2018/wordml/cex" xmlns:w16cid="http://schemas.microsoft.com/office/word/2016/wordml/cid" xmlns:w16="http://schemas.microsoft.com/office/word/2018/wordml" xmlns:w16du="http://schemas.microsoft.com/office/word/2023/wordml/word16du" xmlns:w16sdtdh="http://schemas.microsoft.com/office/word/2020/wordml/sdtdatahash" xmlns:w16sdtfl="http://schemas.microsoft.com/office/word/2024/wordml/sdtformatlock" xmlns:w16se="http://schemas.microsoft.com/office/word/2015/wordml/symex" xmlns:wpg="http://schemas.microsoft.com/office/word/2010/wordprocessingGroup" xmlns:wpi="http://schemas.microsoft.com/office/word/2010/wordprocessingInk" xmlns:wne="http://schemas.microsoft.com/office/word/2006/wordml" xmlns:wps="http://schemas.microsoft.com/office/word/2010/wordprocessingShape" mc:Ignorable="w14 w15 w16se w16cid w16 w16cex w16sdtdh w16sdtfl w16du wp14">
   <w:abstractNum w:abstractNumId="0" w15:restartNumberingAfterBreak="0">
+    <w:nsid w:val="07027DA2"/>
+    <w:multiLevelType w:val="multilevel"/>
+    <w:tmpl w:val="12549B52"/>
+    <w:lvl w:ilvl="0">
+      <w:start w:val="1"/>
+      <w:numFmt w:val="bullet"/>
+      <w:lvlText w:val=""/>
+      <w:lvlJc w:val="left"/>
+      <w:pPr>
+        <w:tabs>
+          <w:tab w:val="num" w:pos="720"/>
+        </w:tabs>
+        <w:ind w:left="720" w:hanging="360"/>
+      </w:pPr>
+      <w:rPr>
+        <w:rFonts w:ascii="Symbol" w:hAnsi="Symbol" w:hint="default"/>
+        <w:sz w:val="20"/>
+      </w:rPr>
+    </w:lvl>
+    <w:lvl w:ilvl="1" w:tentative="1">
+      <w:start w:val="1"/>
+      <w:numFmt w:val="bullet"/>
+      <w:lvlText w:val="o"/>
+      <w:lvlJc w:val="left"/>
+      <w:pPr>
+        <w:tabs>
+          <w:tab w:val="num" w:pos="1440"/>
+        </w:tabs>
+        <w:ind w:left="1440" w:hanging="360"/>
+      </w:pPr>
+      <w:rPr>
+        <w:rFonts w:ascii="Courier New" w:hAnsi="Courier New" w:hint="default"/>
+        <w:sz w:val="20"/>
+      </w:rPr>
+    </w:lvl>
+    <w:lvl w:ilvl="2" w:tentative="1">
+      <w:start w:val="1"/>
+      <w:numFmt w:val="bullet"/>
+      <w:lvlText w:val=""/>
+      <w:lvlJc w:val="left"/>
+      <w:pPr>
+        <w:tabs>
+          <w:tab w:val="num" w:pos="2160"/>
+        </w:tabs>
+        <w:ind w:left="2160" w:hanging="360"/>
+      </w:pPr>
+      <w:rPr>
+        <w:rFonts w:ascii="Wingdings" w:hAnsi="Wingdings" w:hint="default"/>
+        <w:sz w:val="20"/>
+      </w:rPr>
+    </w:lvl>
+    <w:lvl w:ilvl="3" w:tentative="1">
+      <w:start w:val="1"/>
+      <w:numFmt w:val="bullet"/>
+      <w:lvlText w:val=""/>
+      <w:lvlJc w:val="left"/>
+      <w:pPr>
+        <w:tabs>
+          <w:tab w:val="num" w:pos="2880"/>
+        </w:tabs>
+        <w:ind w:left="2880" w:hanging="360"/>
+      </w:pPr>
+      <w:rPr>
+        <w:rFonts w:ascii="Wingdings" w:hAnsi="Wingdings" w:hint="default"/>
+        <w:sz w:val="20"/>
+      </w:rPr>
+    </w:lvl>
+    <w:lvl w:ilvl="4" w:tentative="1">
+      <w:start w:val="1"/>
+      <w:numFmt w:val="bullet"/>
+      <w:lvlText w:val=""/>
+      <w:lvlJc w:val="left"/>
+      <w:pPr>
+        <w:tabs>
+          <w:tab w:val="num" w:pos="3600"/>
+        </w:tabs>
+        <w:ind w:left="3600" w:hanging="360"/>
+      </w:pPr>
+      <w:rPr>
+        <w:rFonts w:ascii="Wingdings" w:hAnsi="Wingdings" w:hint="default"/>
+        <w:sz w:val="20"/>
+      </w:rPr>
+    </w:lvl>
+    <w:lvl w:ilvl="5" w:tentative="1">
+      <w:start w:val="1"/>
+      <w:numFmt w:val="bullet"/>
+      <w:lvlText w:val=""/>
+      <w:lvlJc w:val="left"/>
+      <w:pPr>
+        <w:tabs>
+          <w:tab w:val="num" w:pos="4320"/>
+        </w:tabs>
+        <w:ind w:left="4320" w:hanging="360"/>
+      </w:pPr>
+      <w:rPr>
+        <w:rFonts w:ascii="Wingdings" w:hAnsi="Wingdings" w:hint="default"/>
+        <w:sz w:val="20"/>
+      </w:rPr>
+    </w:lvl>
+    <w:lvl w:ilvl="6" w:tentative="1">
+      <w:start w:val="1"/>
+      <w:numFmt w:val="bullet"/>
+      <w:lvlText w:val=""/>
+      <w:lvlJc w:val="left"/>
+      <w:pPr>
+        <w:tabs>
+          <w:tab w:val="num" w:pos="5040"/>
+        </w:tabs>
+        <w:ind w:left="5040" w:hanging="360"/>
+      </w:pPr>
+      <w:rPr>
+        <w:rFonts w:ascii="Wingdings" w:hAnsi="Wingdings" w:hint="default"/>
+        <w:sz w:val="20"/>
+      </w:rPr>
+    </w:lvl>
+    <w:lvl w:ilvl="7" w:tentative="1">
+      <w:start w:val="1"/>
+      <w:numFmt w:val="bullet"/>
+      <w:lvlText w:val=""/>
+      <w:lvlJc w:val="left"/>
+      <w:pPr>
+        <w:tabs>
+          <w:tab w:val="num" w:pos="5760"/>
+        </w:tabs>
+        <w:ind w:left="5760" w:hanging="360"/>
+      </w:pPr>
+      <w:rPr>
+        <w:rFonts w:ascii="Wingdings" w:hAnsi="Wingdings" w:hint="default"/>
+        <w:sz w:val="20"/>
+      </w:rPr>
+    </w:lvl>
+    <w:lvl w:ilvl="8" w:tentative="1">
+      <w:start w:val="1"/>
+      <w:numFmt w:val="bullet"/>
+      <w:lvlText w:val=""/>
+      <w:lvlJc w:val="left"/>
+      <w:pPr>
+        <w:tabs>
+          <w:tab w:val="num" w:pos="6480"/>
+        </w:tabs>
+        <w:ind w:left="6480" w:hanging="360"/>
+      </w:pPr>
+      <w:rPr>
+        <w:rFonts w:ascii="Wingdings" w:hAnsi="Wingdings" w:hint="default"/>
+        <w:sz w:val="20"/>
+      </w:rPr>
+    </w:lvl>
+  </w:abstractNum>
+  <w:abstractNum w:abstractNumId="1" w15:restartNumberingAfterBreak="0">
     <w:nsid w:val="1918642B"/>
     <w:multiLevelType w:val="multilevel"/>
     <w:tmpl w:val="43A2EB06"/>
@@ -1190,7 +2112,7 @@
       </w:pPr>
     </w:lvl>
   </w:abstractNum>
-  <w:abstractNum w:abstractNumId="1" w15:restartNumberingAfterBreak="0">
+  <w:abstractNum w:abstractNumId="2" w15:restartNumberingAfterBreak="0">
     <w:nsid w:val="255B4629"/>
     <w:multiLevelType w:val="multilevel"/>
     <w:tmpl w:val="B690465E"/>
@@ -1339,7 +2261,7 @@
       </w:rPr>
     </w:lvl>
   </w:abstractNum>
-  <w:abstractNum w:abstractNumId="2" w15:restartNumberingAfterBreak="0">
+  <w:abstractNum w:abstractNumId="3" w15:restartNumberingAfterBreak="0">
     <w:nsid w:val="2F64518B"/>
     <w:multiLevelType w:val="multilevel"/>
     <w:tmpl w:val="355207FC"/>
@@ -1488,7 +2410,273 @@
       </w:rPr>
     </w:lvl>
   </w:abstractNum>
-  <w:abstractNum w:abstractNumId="3" w15:restartNumberingAfterBreak="0">
+  <w:abstractNum w:abstractNumId="4" w15:restartNumberingAfterBreak="0">
+    <w:nsid w:val="32B4701C"/>
+    <w:multiLevelType w:val="multilevel"/>
+    <w:tmpl w:val="81087092"/>
+    <w:lvl w:ilvl="0">
+      <w:start w:val="1"/>
+      <w:numFmt w:val="bullet"/>
+      <w:lvlText w:val=""/>
+      <w:lvlJc w:val="left"/>
+      <w:pPr>
+        <w:tabs>
+          <w:tab w:val="num" w:pos="720"/>
+        </w:tabs>
+        <w:ind w:left="720" w:hanging="360"/>
+      </w:pPr>
+      <w:rPr>
+        <w:rFonts w:ascii="Symbol" w:hAnsi="Symbol" w:hint="default"/>
+        <w:sz w:val="20"/>
+      </w:rPr>
+    </w:lvl>
+    <w:lvl w:ilvl="1" w:tentative="1">
+      <w:start w:val="1"/>
+      <w:numFmt w:val="bullet"/>
+      <w:lvlText w:val="o"/>
+      <w:lvlJc w:val="left"/>
+      <w:pPr>
+        <w:tabs>
+          <w:tab w:val="num" w:pos="1440"/>
+        </w:tabs>
+        <w:ind w:left="1440" w:hanging="360"/>
+      </w:pPr>
+      <w:rPr>
+        <w:rFonts w:ascii="Courier New" w:hAnsi="Courier New" w:hint="default"/>
+        <w:sz w:val="20"/>
+      </w:rPr>
+    </w:lvl>
+    <w:lvl w:ilvl="2" w:tentative="1">
+      <w:start w:val="1"/>
+      <w:numFmt w:val="bullet"/>
+      <w:lvlText w:val=""/>
+      <w:lvlJc w:val="left"/>
+      <w:pPr>
+        <w:tabs>
+          <w:tab w:val="num" w:pos="2160"/>
+        </w:tabs>
+        <w:ind w:left="2160" w:hanging="360"/>
+      </w:pPr>
+      <w:rPr>
+        <w:rFonts w:ascii="Wingdings" w:hAnsi="Wingdings" w:hint="default"/>
+        <w:sz w:val="20"/>
+      </w:rPr>
+    </w:lvl>
+    <w:lvl w:ilvl="3" w:tentative="1">
+      <w:start w:val="1"/>
+      <w:numFmt w:val="bullet"/>
+      <w:lvlText w:val=""/>
+      <w:lvlJc w:val="left"/>
+      <w:pPr>
+        <w:tabs>
+          <w:tab w:val="num" w:pos="2880"/>
+        </w:tabs>
+        <w:ind w:left="2880" w:hanging="360"/>
+      </w:pPr>
+      <w:rPr>
+        <w:rFonts w:ascii="Wingdings" w:hAnsi="Wingdings" w:hint="default"/>
+        <w:sz w:val="20"/>
+      </w:rPr>
+    </w:lvl>
+    <w:lvl w:ilvl="4" w:tentative="1">
+      <w:start w:val="1"/>
+      <w:numFmt w:val="bullet"/>
+      <w:lvlText w:val=""/>
+      <w:lvlJc w:val="left"/>
+      <w:pPr>
+        <w:tabs>
+          <w:tab w:val="num" w:pos="3600"/>
+        </w:tabs>
+        <w:ind w:left="3600" w:hanging="360"/>
+      </w:pPr>
+      <w:rPr>
+        <w:rFonts w:ascii="Wingdings" w:hAnsi="Wingdings" w:hint="default"/>
+        <w:sz w:val="20"/>
+      </w:rPr>
+    </w:lvl>
+    <w:lvl w:ilvl="5" w:tentative="1">
+      <w:start w:val="1"/>
+      <w:numFmt w:val="bullet"/>
+      <w:lvlText w:val=""/>
+      <w:lvlJc w:val="left"/>
+      <w:pPr>
+        <w:tabs>
+          <w:tab w:val="num" w:pos="4320"/>
+        </w:tabs>
+        <w:ind w:left="4320" w:hanging="360"/>
+      </w:pPr>
+      <w:rPr>
+        <w:rFonts w:ascii="Wingdings" w:hAnsi="Wingdings" w:hint="default"/>
+        <w:sz w:val="20"/>
+      </w:rPr>
+    </w:lvl>
+    <w:lvl w:ilvl="6" w:tentative="1">
+      <w:start w:val="1"/>
+      <w:numFmt w:val="bullet"/>
+      <w:lvlText w:val=""/>
+      <w:lvlJc w:val="left"/>
+      <w:pPr>
+        <w:tabs>
+          <w:tab w:val="num" w:pos="5040"/>
+        </w:tabs>
+        <w:ind w:left="5040" w:hanging="360"/>
+      </w:pPr>
+      <w:rPr>
+        <w:rFonts w:ascii="Wingdings" w:hAnsi="Wingdings" w:hint="default"/>
+        <w:sz w:val="20"/>
+      </w:rPr>
+    </w:lvl>
+    <w:lvl w:ilvl="7" w:tentative="1">
+      <w:start w:val="1"/>
+      <w:numFmt w:val="bullet"/>
+      <w:lvlText w:val=""/>
+      <w:lvlJc w:val="left"/>
+      <w:pPr>
+        <w:tabs>
+          <w:tab w:val="num" w:pos="5760"/>
+        </w:tabs>
+        <w:ind w:left="5760" w:hanging="360"/>
+      </w:pPr>
+      <w:rPr>
+        <w:rFonts w:ascii="Wingdings" w:hAnsi="Wingdings" w:hint="default"/>
+        <w:sz w:val="20"/>
+      </w:rPr>
+    </w:lvl>
+    <w:lvl w:ilvl="8" w:tentative="1">
+      <w:start w:val="1"/>
+      <w:numFmt w:val="bullet"/>
+      <w:lvlText w:val=""/>
+      <w:lvlJc w:val="left"/>
+      <w:pPr>
+        <w:tabs>
+          <w:tab w:val="num" w:pos="6480"/>
+        </w:tabs>
+        <w:ind w:left="6480" w:hanging="360"/>
+      </w:pPr>
+      <w:rPr>
+        <w:rFonts w:ascii="Wingdings" w:hAnsi="Wingdings" w:hint="default"/>
+        <w:sz w:val="20"/>
+      </w:rPr>
+    </w:lvl>
+  </w:abstractNum>
+  <w:abstractNum w:abstractNumId="5" w15:restartNumberingAfterBreak="0">
+    <w:nsid w:val="34AD18F4"/>
+    <w:multiLevelType w:val="multilevel"/>
+    <w:tmpl w:val="20908564"/>
+    <w:lvl w:ilvl="0">
+      <w:start w:val="1"/>
+      <w:numFmt w:val="decimal"/>
+      <w:lvlText w:val="%1."/>
+      <w:lvlJc w:val="left"/>
+      <w:pPr>
+        <w:tabs>
+          <w:tab w:val="num" w:pos="720"/>
+        </w:tabs>
+        <w:ind w:left="720" w:hanging="360"/>
+      </w:pPr>
+    </w:lvl>
+    <w:lvl w:ilvl="1">
+      <w:start w:val="1"/>
+      <w:numFmt w:val="bullet"/>
+      <w:lvlText w:val="o"/>
+      <w:lvlJc w:val="left"/>
+      <w:pPr>
+        <w:tabs>
+          <w:tab w:val="num" w:pos="1440"/>
+        </w:tabs>
+        <w:ind w:left="1440" w:hanging="360"/>
+      </w:pPr>
+      <w:rPr>
+        <w:rFonts w:ascii="Courier New" w:hAnsi="Courier New" w:hint="default"/>
+        <w:sz w:val="20"/>
+      </w:rPr>
+    </w:lvl>
+    <w:lvl w:ilvl="2" w:tentative="1">
+      <w:start w:val="1"/>
+      <w:numFmt w:val="decimal"/>
+      <w:lvlText w:val="%3."/>
+      <w:lvlJc w:val="left"/>
+      <w:pPr>
+        <w:tabs>
+          <w:tab w:val="num" w:pos="2160"/>
+        </w:tabs>
+        <w:ind w:left="2160" w:hanging="360"/>
+      </w:pPr>
+    </w:lvl>
+    <w:lvl w:ilvl="3" w:tentative="1">
+      <w:start w:val="1"/>
+      <w:numFmt w:val="decimal"/>
+      <w:lvlText w:val="%4."/>
+      <w:lvlJc w:val="left"/>
+      <w:pPr>
+        <w:tabs>
+          <w:tab w:val="num" w:pos="2880"/>
+        </w:tabs>
+        <w:ind w:left="2880" w:hanging="360"/>
+      </w:pPr>
+    </w:lvl>
+    <w:lvl w:ilvl="4" w:tentative="1">
+      <w:start w:val="1"/>
+      <w:numFmt w:val="decimal"/>
+      <w:lvlText w:val="%5."/>
+      <w:lvlJc w:val="left"/>
+      <w:pPr>
+        <w:tabs>
+          <w:tab w:val="num" w:pos="3600"/>
+        </w:tabs>
+        <w:ind w:left="3600" w:hanging="360"/>
+      </w:pPr>
+    </w:lvl>
+    <w:lvl w:ilvl="5" w:tentative="1">
+      <w:start w:val="1"/>
+      <w:numFmt w:val="decimal"/>
+      <w:lvlText w:val="%6."/>
+      <w:lvlJc w:val="left"/>
+      <w:pPr>
+        <w:tabs>
+          <w:tab w:val="num" w:pos="4320"/>
+        </w:tabs>
+        <w:ind w:left="4320" w:hanging="360"/>
+      </w:pPr>
+    </w:lvl>
+    <w:lvl w:ilvl="6" w:tentative="1">
+      <w:start w:val="1"/>
+      <w:numFmt w:val="decimal"/>
+      <w:lvlText w:val="%7."/>
+      <w:lvlJc w:val="left"/>
+      <w:pPr>
+        <w:tabs>
+          <w:tab w:val="num" w:pos="5040"/>
+        </w:tabs>
+        <w:ind w:left="5040" w:hanging="360"/>
+      </w:pPr>
+    </w:lvl>
+    <w:lvl w:ilvl="7" w:tentative="1">
+      <w:start w:val="1"/>
+      <w:numFmt w:val="decimal"/>
+      <w:lvlText w:val="%8."/>
+      <w:lvlJc w:val="left"/>
+      <w:pPr>
+        <w:tabs>
+          <w:tab w:val="num" w:pos="5760"/>
+        </w:tabs>
+        <w:ind w:left="5760" w:hanging="360"/>
+      </w:pPr>
+    </w:lvl>
+    <w:lvl w:ilvl="8" w:tentative="1">
+      <w:start w:val="1"/>
+      <w:numFmt w:val="decimal"/>
+      <w:lvlText w:val="%9."/>
+      <w:lvlJc w:val="left"/>
+      <w:pPr>
+        <w:tabs>
+          <w:tab w:val="num" w:pos="6480"/>
+        </w:tabs>
+        <w:ind w:left="6480" w:hanging="360"/>
+      </w:pPr>
+    </w:lvl>
+  </w:abstractNum>
+  <w:abstractNum w:abstractNumId="6" w15:restartNumberingAfterBreak="0">
     <w:nsid w:val="4912032C"/>
     <w:multiLevelType w:val="multilevel"/>
     <w:tmpl w:val="E25EEE3C"/>
@@ -1606,16 +2794,25 @@
     </w:lvl>
   </w:abstractNum>
   <w:num w:numId="1" w16cid:durableId="1706563159">
-    <w:abstractNumId w:val="0"/>
+    <w:abstractNumId w:val="1"/>
   </w:num>
   <w:num w:numId="2" w16cid:durableId="1611204573">
+    <w:abstractNumId w:val="3"/>
+  </w:num>
+  <w:num w:numId="3" w16cid:durableId="486748290">
+    <w:abstractNumId w:val="6"/>
+  </w:num>
+  <w:num w:numId="4" w16cid:durableId="40832755">
     <w:abstractNumId w:val="2"/>
   </w:num>
-  <w:num w:numId="3" w16cid:durableId="486748290">
-    <w:abstractNumId w:val="3"/>
+  <w:num w:numId="5" w16cid:durableId="2030570697">
+    <w:abstractNumId w:val="4"/>
   </w:num>
-  <w:num w:numId="4" w16cid:durableId="40832755">
-    <w:abstractNumId w:val="1"/>
+  <w:num w:numId="6" w16cid:durableId="1919366430">
+    <w:abstractNumId w:val="5"/>
+  </w:num>
+  <w:num w:numId="7" w16cid:durableId="346292990">
+    <w:abstractNumId w:val="0"/>
   </w:num>
 </w:numbering>
 </file>

</xml_diff>

<commit_message>
Odd or Even Sum
</commit_message>
<xml_diff>
--- a/Practice Idea - Learning Hub App.docx
+++ b/Practice Idea - Learning Hub App.docx
@@ -579,10 +579,12 @@
         <w:t>: Using a Map&lt;</w:t>
       </w:r>
       <w:proofErr w:type="spellStart"/>
+      <w:proofErr w:type="gramStart"/>
       <w:r>
         <w:t>String,bool</w:t>
       </w:r>
       <w:proofErr w:type="spellEnd"/>
+      <w:proofErr w:type="gramEnd"/>
       <w:r>
         <w:t>&gt; for lessons is perfect — it makes progress calculation straightforward.</w:t>
       </w:r>
@@ -624,20 +626,30 @@
         <w:t xml:space="preserve">: Your </w:t>
       </w:r>
       <w:proofErr w:type="spellStart"/>
+      <w:proofErr w:type="gramStart"/>
       <w:r>
         <w:t>compPercent</w:t>
       </w:r>
       <w:proofErr w:type="spellEnd"/>
       <w:r>
-        <w:t xml:space="preserve">() and </w:t>
-      </w:r>
-      <w:proofErr w:type="spellStart"/>
+        <w:t>(</w:t>
+      </w:r>
+      <w:proofErr w:type="gramEnd"/>
+      <w:r>
+        <w:t xml:space="preserve">) and </w:t>
+      </w:r>
+      <w:proofErr w:type="spellStart"/>
+      <w:proofErr w:type="gramStart"/>
       <w:r>
         <w:t>milStoneNotify</w:t>
       </w:r>
       <w:proofErr w:type="spellEnd"/>
       <w:r>
-        <w:t>() methods are well</w:t>
+        <w:t>(</w:t>
+      </w:r>
+      <w:proofErr w:type="gramEnd"/>
+      <w:r>
+        <w:t>) methods are well</w:t>
       </w:r>
       <w:r>
         <w:noBreakHyphen/>
@@ -697,7 +709,15 @@
         </w:numPr>
       </w:pPr>
       <w:r>
-        <w:t xml:space="preserve">Right now you increment </w:t>
+        <w:t xml:space="preserve">Right </w:t>
+      </w:r>
+      <w:proofErr w:type="gramStart"/>
+      <w:r>
+        <w:t>now</w:t>
+      </w:r>
+      <w:proofErr w:type="gramEnd"/>
+      <w:r>
+        <w:t xml:space="preserve"> you increment </w:t>
       </w:r>
       <w:proofErr w:type="spellStart"/>
       <w:r>
@@ -855,7 +875,15 @@
         </w:numPr>
       </w:pPr>
       <w:r>
-        <w:t>Right now you check for exact percentages (25, 50, 75, 100). But floating</w:t>
+        <w:t xml:space="preserve">Right </w:t>
+      </w:r>
+      <w:proofErr w:type="gramStart"/>
+      <w:r>
+        <w:t>now</w:t>
+      </w:r>
+      <w:proofErr w:type="gramEnd"/>
+      <w:r>
+        <w:t xml:space="preserve"> you check for exact percentages (25, 50, 75, 100). But floating</w:t>
       </w:r>
       <w:r>
         <w:noBreakHyphen/>
@@ -901,7 +929,15 @@
       </w:r>
       <w:proofErr w:type="spellEnd"/>
       <w:r>
-        <w:t xml:space="preserve"> returns Object?. Since it’s really returning either a String (lesson name/message) or null, you could tighten it to String? for clarity.</w:t>
+        <w:t xml:space="preserve"> returns </w:t>
+      </w:r>
+      <w:proofErr w:type="gramStart"/>
+      <w:r>
+        <w:t>Object?.</w:t>
+      </w:r>
+      <w:proofErr w:type="gramEnd"/>
+      <w:r>
+        <w:t xml:space="preserve"> Since it’s really returning either a String (lesson name/message) or null, you could tighten it to String? for clarity.</w:t>
       </w:r>
     </w:p>
     <w:p>
@@ -1203,10 +1239,12 @@
         <w:t>: You’re now updating the lessons map directly (</w:t>
       </w:r>
       <w:proofErr w:type="spellStart"/>
+      <w:proofErr w:type="gramStart"/>
       <w:r>
         <w:t>course.lessons</w:t>
       </w:r>
       <w:proofErr w:type="spellEnd"/>
+      <w:proofErr w:type="gramEnd"/>
       <w:r>
         <w:t>[</w:t>
       </w:r>
@@ -1261,7 +1299,15 @@
         <w:t>Report class</w:t>
       </w:r>
       <w:r>
-        <w:t>: Clean separation — User passes itself, Report handles the summary. Nice design.</w:t>
+        <w:t xml:space="preserve">: Clean separation — User passes </w:t>
+      </w:r>
+      <w:proofErr w:type="gramStart"/>
+      <w:r>
+        <w:t>itself,</w:t>
+      </w:r>
+      <w:proofErr w:type="gramEnd"/>
+      <w:r>
+        <w:t xml:space="preserve"> Report handles the summary. Nice design.</w:t>
       </w:r>
     </w:p>
     <w:p>
@@ -1346,14 +1392,20 @@
         <w:t xml:space="preserve">void </w:t>
       </w:r>
       <w:proofErr w:type="spellStart"/>
+      <w:proofErr w:type="gramStart"/>
       <w:r>
         <w:t>logIn</w:t>
       </w:r>
       <w:proofErr w:type="spellEnd"/>
       <w:r>
-        <w:t xml:space="preserve">(String email, String </w:t>
-      </w:r>
-      <w:proofErr w:type="spellStart"/>
+        <w:t>(</w:t>
+      </w:r>
+      <w:proofErr w:type="gramEnd"/>
+      <w:r>
+        <w:t xml:space="preserve">String email, String </w:t>
+      </w:r>
+      <w:proofErr w:type="spellStart"/>
+      <w:proofErr w:type="gramStart"/>
       <w:r>
         <w:t>pwd</w:t>
       </w:r>
@@ -1361,6 +1413,7 @@
       <w:r>
         <w:t>){</w:t>
       </w:r>
+      <w:proofErr w:type="gramEnd"/>
     </w:p>
     <w:p>
       <w:pPr>
@@ -1376,12 +1429,17 @@
         <w:t xml:space="preserve">  </w:t>
       </w:r>
       <w:proofErr w:type="spellStart"/>
+      <w:proofErr w:type="gramStart"/>
       <w:r>
         <w:t>logIn</w:t>
       </w:r>
       <w:proofErr w:type="spellEnd"/>
       <w:r>
-        <w:t xml:space="preserve">(email, </w:t>
+        <w:t>(</w:t>
+      </w:r>
+      <w:proofErr w:type="gramEnd"/>
+      <w:r>
+        <w:t xml:space="preserve">email, </w:t>
       </w:r>
       <w:proofErr w:type="spellStart"/>
       <w:r>
@@ -1424,14 +1482,20 @@
         <w:t xml:space="preserve">void </w:t>
       </w:r>
       <w:proofErr w:type="spellStart"/>
+      <w:proofErr w:type="gramStart"/>
       <w:r>
         <w:t>logIn</w:t>
       </w:r>
       <w:proofErr w:type="spellEnd"/>
       <w:r>
-        <w:t xml:space="preserve">(String email, String </w:t>
-      </w:r>
-      <w:proofErr w:type="spellStart"/>
+        <w:t>(</w:t>
+      </w:r>
+      <w:proofErr w:type="gramEnd"/>
+      <w:r>
+        <w:t xml:space="preserve">String email, String </w:t>
+      </w:r>
+      <w:proofErr w:type="spellStart"/>
+      <w:proofErr w:type="gramStart"/>
       <w:r>
         <w:t>pwd</w:t>
       </w:r>
@@ -1439,10 +1503,19 @@
       <w:r>
         <w:t>){</w:t>
       </w:r>
-    </w:p>
-    <w:p>
-      <w:r>
-        <w:t xml:space="preserve">  login(email, </w:t>
+      <w:proofErr w:type="gramEnd"/>
+    </w:p>
+    <w:p>
+      <w:r>
+        <w:t xml:space="preserve">  </w:t>
+      </w:r>
+      <w:proofErr w:type="gramStart"/>
+      <w:r>
+        <w:t>login(</w:t>
+      </w:r>
+      <w:proofErr w:type="gramEnd"/>
+      <w:r>
+        <w:t xml:space="preserve">email, </w:t>
       </w:r>
       <w:proofErr w:type="spellStart"/>
       <w:r>
@@ -1468,12 +1541,25 @@
         <w:t xml:space="preserve">Same for </w:t>
       </w:r>
       <w:proofErr w:type="spellStart"/>
+      <w:proofErr w:type="gramStart"/>
       <w:r>
         <w:t>logOut</w:t>
       </w:r>
       <w:proofErr w:type="spellEnd"/>
       <w:r>
-        <w:t xml:space="preserve">() → call logout() from the </w:t>
+        <w:t>(</w:t>
+      </w:r>
+      <w:proofErr w:type="gramEnd"/>
+      <w:r>
+        <w:t xml:space="preserve">) → call </w:t>
+      </w:r>
+      <w:proofErr w:type="gramStart"/>
+      <w:r>
+        <w:t>logout(</w:t>
+      </w:r>
+      <w:proofErr w:type="gramEnd"/>
+      <w:r>
+        <w:t xml:space="preserve">) from the </w:t>
       </w:r>
       <w:proofErr w:type="spellStart"/>
       <w:r>
@@ -1506,12 +1592,17 @@
         <w:t xml:space="preserve">Your </w:t>
       </w:r>
       <w:proofErr w:type="spellStart"/>
+      <w:proofErr w:type="gramStart"/>
       <w:r>
         <w:t>countFinishedLessons</w:t>
       </w:r>
       <w:proofErr w:type="spellEnd"/>
       <w:r>
-        <w:t xml:space="preserve">() currently increments </w:t>
+        <w:t>(</w:t>
+      </w:r>
+      <w:proofErr w:type="gramEnd"/>
+      <w:r>
+        <w:t xml:space="preserve">) currently increments </w:t>
       </w:r>
       <w:proofErr w:type="spellStart"/>
       <w:r>
@@ -1635,7 +1726,15 @@
     </w:p>
     <w:p>
       <w:r>
-        <w:t>Right now it works fine — it returns the first unfinished lesson. If you want to process logic before returning, you’d need to restructure slightly, but the current approach is valid.</w:t>
+        <w:t xml:space="preserve">Right </w:t>
+      </w:r>
+      <w:proofErr w:type="gramStart"/>
+      <w:r>
+        <w:t>now</w:t>
+      </w:r>
+      <w:proofErr w:type="gramEnd"/>
+      <w:r>
+        <w:t xml:space="preserve"> it works fine — it returns the first unfinished lesson. If you want to process logic before returning, you’d need to restructure slightly, but the current approach is valid.</w:t>
       </w:r>
     </w:p>
     <w:p>

</xml_diff>